<commit_message>
Added curl troubleshooting guide
Added a section on how to fix the issue where CURL commands are blocked after installing Avast antivirus.  You need to disable HTTPS Scanning features since CURL needs OSCP/CRL checking and Avast intercepts TLS requests and does not deliver those services.
</commit_message>
<xml_diff>
--- a/PowerShellScriptsAdam/Adams_PowerShell_Script_Instructions.docx
+++ b/PowerShellScriptsAdam/Adams_PowerShell_Script_Instructions.docx
@@ -96,21 +96,7 @@
           <w:sz w:val="36"/>
           <w:szCs w:val="36"/>
         </w:rPr>
-        <w:t>Updated Ju</w:t>
-      </w:r>
-      <w:r>
-        <w:rPr>
-          <w:sz w:val="36"/>
-          <w:szCs w:val="36"/>
-        </w:rPr>
-        <w:t>ly</w:t>
-      </w:r>
-      <w:r>
-        <w:rPr>
-          <w:sz w:val="36"/>
-          <w:szCs w:val="36"/>
-        </w:rPr>
-        <w:t xml:space="preserve"> 2026</w:t>
+        <w:t>Updated July 2026</w:t>
       </w:r>
     </w:p>
     <w:p>
@@ -216,7 +202,7 @@
         <w:pStyle w:val="Heading1"/>
         <w:numPr>
           <w:ilvl w:val="0"/>
-          <w:numId w:val="2"/>
+          <w:numId w:val="1"/>
         </w:numPr>
         <w:ind w:hanging="0" w:left="0"/>
         <w:rPr/>
@@ -263,7 +249,7 @@
         <w:widowControl/>
         <w:numPr>
           <w:ilvl w:val="1"/>
-          <w:numId w:val="4"/>
+          <w:numId w:val="3"/>
         </w:numPr>
         <w:suppressAutoHyphens w:val="true"/>
         <w:bidi w:val="0"/>
@@ -327,7 +313,7 @@
         <w:pStyle w:val="Heading2"/>
         <w:numPr>
           <w:ilvl w:val="1"/>
-          <w:numId w:val="4"/>
+          <w:numId w:val="3"/>
         </w:numPr>
         <w:bidi w:val="0"/>
         <w:ind w:hanging="0" w:left="0"/>
@@ -343,7 +329,7 @@
         <w:pStyle w:val="Heading2"/>
         <w:numPr>
           <w:ilvl w:val="1"/>
-          <w:numId w:val="4"/>
+          <w:numId w:val="3"/>
         </w:numPr>
         <w:bidi w:val="0"/>
         <w:ind w:hanging="0" w:left="0"/>
@@ -385,7 +371,7 @@
         <w:widowControl/>
         <w:numPr>
           <w:ilvl w:val="1"/>
-          <w:numId w:val="4"/>
+          <w:numId w:val="3"/>
         </w:numPr>
         <w:suppressAutoHyphens w:val="true"/>
         <w:bidi w:val="0"/>
@@ -455,7 +441,7 @@
         <w:widowControl/>
         <w:numPr>
           <w:ilvl w:val="1"/>
-          <w:numId w:val="4"/>
+          <w:numId w:val="3"/>
         </w:numPr>
         <w:suppressAutoHyphens w:val="true"/>
         <w:bidi w:val="0"/>
@@ -559,7 +545,7 @@
         <w:pStyle w:val="Heading1"/>
         <w:numPr>
           <w:ilvl w:val="0"/>
-          <w:numId w:val="2"/>
+          <w:numId w:val="1"/>
         </w:numPr>
         <w:ind w:hanging="0" w:left="0"/>
         <w:rPr/>
@@ -604,7 +590,7 @@
         <w:pStyle w:val="Heading3"/>
         <w:numPr>
           <w:ilvl w:val="2"/>
-          <w:numId w:val="3"/>
+          <w:numId w:val="2"/>
         </w:numPr>
         <w:ind w:hanging="0" w:left="0"/>
         <w:rPr/>
@@ -618,7 +604,7 @@
         <w:pStyle w:val="Heading3"/>
         <w:numPr>
           <w:ilvl w:val="2"/>
-          <w:numId w:val="3"/>
+          <w:numId w:val="2"/>
         </w:numPr>
         <w:ind w:hanging="0" w:left="0"/>
         <w:rPr/>
@@ -644,7 +630,7 @@
         <w:pStyle w:val="Normal"/>
         <w:numPr>
           <w:ilvl w:val="0"/>
-          <w:numId w:val="5"/>
+          <w:numId w:val="4"/>
         </w:numPr>
         <w:bidi w:val="0"/>
         <w:jc w:val="left"/>
@@ -660,7 +646,7 @@
         <w:pStyle w:val="Normal"/>
         <w:numPr>
           <w:ilvl w:val="0"/>
-          <w:numId w:val="5"/>
+          <w:numId w:val="4"/>
         </w:numPr>
         <w:bidi w:val="0"/>
         <w:jc w:val="left"/>
@@ -726,6 +712,244 @@
     <w:p>
       <w:pPr>
         <w:pStyle w:val="Normal"/>
+        <w:bidi w:val="0"/>
+        <w:ind w:hanging="0" w:left="709"/>
+        <w:jc w:val="left"/>
+        <w:rPr>
+          <w:rFonts w:ascii="Lucida Console" w:hAnsi="Lucida Console"/>
+          <w:sz w:val="28"/>
+          <w:szCs w:val="28"/>
+        </w:rPr>
+      </w:pPr>
+      <w:r>
+        <w:rPr>
+          <w:rFonts w:ascii="Lucida Console" w:hAnsi="Lucida Console"/>
+          <w:sz w:val="28"/>
+          <w:szCs w:val="28"/>
+        </w:rPr>
+        <mc:AlternateContent>
+          <mc:Choice Requires="wps">
+            <w:drawing>
+              <wp:anchor distT="0" distB="0" distL="0" distR="0" simplePos="0" relativeHeight="4" behindDoc="0" locked="0" layoutInCell="1" allowOverlap="1">
+                <wp:simplePos x="0" y="0"/>
+                <wp:positionH relativeFrom="column">
+                  <wp:posOffset>-5715</wp:posOffset>
+                </wp:positionH>
+                <wp:positionV relativeFrom="paragraph">
+                  <wp:posOffset>87630</wp:posOffset>
+                </wp:positionV>
+                <wp:extent cx="6248400" cy="0"/>
+                <wp:effectExtent l="635" t="635" r="635" b="635"/>
+                <wp:wrapNone/>
+                <wp:docPr id="1" name="Horizontal line 2"/>
+                <a:graphic xmlns:a="http://schemas.openxmlformats.org/drawingml/2006/main">
+                  <a:graphicData uri="http://schemas.microsoft.com/office/word/2010/wordprocessingShape">
+                    <wps:wsp>
+                      <wps:cNvSpPr/>
+                      <wps:spPr>
+                        <a:xfrm>
+                          <a:off x="0" y="0"/>
+                          <a:ext cx="6248520" cy="0"/>
+                        </a:xfrm>
+                        <a:prstGeom prst="line">
+                          <a:avLst/>
+                        </a:prstGeom>
+                        <a:ln w="0">
+                          <a:solidFill>
+                            <a:srgbClr val="3465A4"/>
+                          </a:solidFill>
+                        </a:ln>
+                      </wps:spPr>
+                      <wps:style>
+                        <a:lnRef idx="0"/>
+                        <a:fillRef idx="0"/>
+                        <a:effectRef idx="0"/>
+                        <a:fontRef idx="minor"/>
+                      </wps:style>
+                      <wps:bodyPr/>
+                    </wps:wsp>
+                  </a:graphicData>
+                </a:graphic>
+              </wp:anchor>
+            </w:drawing>
+          </mc:Choice>
+          <mc:Fallback>
+            <w:pict>
+              <v:line id="shape_0" from="-0.45pt,6.9pt" to="491.5pt,6.9pt" stroked="t" o:allowincell="f" style="position:absolute">
+                <v:stroke color="#3465a4" joinstyle="round" endcap="flat"/>
+                <v:fill o:detectmouseclick="t" on="false"/>
+                <w10:wrap type="none"/>
+              </v:line>
+            </w:pict>
+          </mc:Fallback>
+        </mc:AlternateContent>
+      </w:r>
+    </w:p>
+    <w:p>
+      <w:pPr>
+        <w:pStyle w:val="Normal"/>
+        <w:rPr/>
+      </w:pPr>
+      <w:r>
+        <w:rPr>
+          <w:b/>
+          <w:bCs/>
+        </w:rPr>
+        <w:t>Troubleshooting tip:</w:t>
+      </w:r>
+      <w:r>
+        <w:rPr/>
+        <w:t xml:space="preserve"> </w:t>
+      </w:r>
+      <w:r>
+        <w:rPr/>
+        <w:t xml:space="preserve">I noticed in June 2026 that </w:t>
+      </w:r>
+      <w:r>
+        <w:rPr>
+          <w:color w:val="C9211E"/>
+        </w:rPr>
+        <w:t>after installing Avast Free Antivirus software, the curl command fails.</w:t>
+      </w:r>
+      <w:r>
+        <w:rPr/>
+        <w:t xml:space="preserve">  To fix this, open up Avast Free Antivirus and click on:</w:t>
+      </w:r>
+    </w:p>
+    <w:p>
+      <w:pPr>
+        <w:pStyle w:val="Normal"/>
+        <w:rPr/>
+      </w:pPr>
+      <w:r>
+        <w:rPr/>
+      </w:r>
+    </w:p>
+    <w:p>
+      <w:pPr>
+        <w:pStyle w:val="Normal"/>
+        <w:ind w:hanging="0" w:left="709"/>
+        <w:rPr>
+          <w:rFonts w:ascii="Lucida Console" w:hAnsi="Lucida Console"/>
+        </w:rPr>
+      </w:pPr>
+      <w:r>
+        <w:rPr>
+          <w:rFonts w:ascii="Lucida Console" w:hAnsi="Lucida Console"/>
+        </w:rPr>
+        <w:t xml:space="preserve">Menu → Settings → Scam Guardian → </w:t>
+      </w:r>
+      <w:r>
+        <w:rPr>
+          <w:rFonts w:ascii="Lucida Console" w:hAnsi="Lucida Console"/>
+        </w:rPr>
+        <w:t>Dis</w:t>
+      </w:r>
+      <w:r>
+        <w:rPr>
+          <w:rFonts w:ascii="Lucida Console" w:hAnsi="Lucida Console"/>
+        </w:rPr>
+        <w:t xml:space="preserve">able HTTPS scanning </w:t>
+      </w:r>
+    </w:p>
+    <w:p>
+      <w:pPr>
+        <w:pStyle w:val="Normal"/>
+        <w:bidi w:val="0"/>
+        <w:ind w:hanging="0" w:left="709"/>
+        <w:jc w:val="left"/>
+        <w:rPr>
+          <w:rFonts w:ascii="Lucida Console" w:hAnsi="Lucida Console"/>
+          <w:sz w:val="28"/>
+          <w:szCs w:val="28"/>
+        </w:rPr>
+      </w:pPr>
+      <w:r>
+        <w:rPr>
+          <w:rFonts w:ascii="Lucida Console" w:hAnsi="Lucida Console"/>
+          <w:sz w:val="28"/>
+          <w:szCs w:val="28"/>
+        </w:rPr>
+      </w:r>
+    </w:p>
+    <w:p>
+      <w:pPr>
+        <w:pStyle w:val="Normal"/>
+        <w:rPr/>
+      </w:pPr>
+      <w:r>
+        <w:rPr/>
+        <w:t>Ideally, when you are done refurbishing the computer, change the Avast setting back to enable HTTPS scanning.</w:t>
+      </w:r>
+    </w:p>
+    <w:p>
+      <w:pPr>
+        <w:pStyle w:val="Normal"/>
+        <w:rPr/>
+      </w:pPr>
+      <w:r>
+        <w:rPr/>
+        <mc:AlternateContent>
+          <mc:Choice Requires="wps">
+            <w:drawing>
+              <wp:anchor distT="0" distB="0" distL="0" distR="0" simplePos="0" relativeHeight="3" behindDoc="0" locked="0" layoutInCell="1" allowOverlap="1">
+                <wp:simplePos x="0" y="0"/>
+                <wp:positionH relativeFrom="column">
+                  <wp:posOffset>32385</wp:posOffset>
+                </wp:positionH>
+                <wp:positionV relativeFrom="paragraph">
+                  <wp:posOffset>157480</wp:posOffset>
+                </wp:positionV>
+                <wp:extent cx="6223000" cy="0"/>
+                <wp:effectExtent l="635" t="635" r="635" b="635"/>
+                <wp:wrapNone/>
+                <wp:docPr id="2" name="Horizontal line 1"/>
+                <a:graphic xmlns:a="http://schemas.openxmlformats.org/drawingml/2006/main">
+                  <a:graphicData uri="http://schemas.microsoft.com/office/word/2010/wordprocessingShape">
+                    <wps:wsp>
+                      <wps:cNvSpPr/>
+                      <wps:spPr>
+                        <a:xfrm>
+                          <a:off x="0" y="0"/>
+                          <a:ext cx="6222960" cy="0"/>
+                        </a:xfrm>
+                        <a:prstGeom prst="line">
+                          <a:avLst/>
+                        </a:prstGeom>
+                        <a:ln w="0">
+                          <a:solidFill>
+                            <a:srgbClr val="3465A4"/>
+                          </a:solidFill>
+                        </a:ln>
+                      </wps:spPr>
+                      <wps:style>
+                        <a:lnRef idx="0"/>
+                        <a:fillRef idx="0"/>
+                        <a:effectRef idx="0"/>
+                        <a:fontRef idx="minor"/>
+                      </wps:style>
+                      <wps:bodyPr/>
+                    </wps:wsp>
+                  </a:graphicData>
+                </a:graphic>
+              </wp:anchor>
+            </w:drawing>
+          </mc:Choice>
+          <mc:Fallback>
+            <w:pict>
+              <v:line id="shape_0" from="2.55pt,12.4pt" to="492.5pt,12.4pt" stroked="t" o:allowincell="f" style="position:absolute">
+                <v:stroke color="#3465a4" joinstyle="round" endcap="flat"/>
+                <v:fill o:detectmouseclick="t" on="false"/>
+                <w10:wrap type="none"/>
+              </v:line>
+            </w:pict>
+          </mc:Fallback>
+        </mc:AlternateContent>
+      </w:r>
+    </w:p>
+    <w:p>
+      <w:pPr>
+        <w:pStyle w:val="Normal"/>
         <w:numPr>
           <w:ilvl w:val="0"/>
           <w:numId w:val="0"/>
@@ -744,7 +968,7 @@
         <w:pStyle w:val="Normal"/>
         <w:numPr>
           <w:ilvl w:val="0"/>
-          <w:numId w:val="5"/>
+          <w:numId w:val="4"/>
         </w:numPr>
         <w:bidi w:val="0"/>
         <w:jc w:val="left"/>
@@ -771,7 +995,7 @@
         <w:pStyle w:val="Normal"/>
         <w:numPr>
           <w:ilvl w:val="0"/>
-          <w:numId w:val="5"/>
+          <w:numId w:val="4"/>
         </w:numPr>
         <w:bidi w:val="0"/>
         <w:jc w:val="left"/>
@@ -801,7 +1025,7 @@
         <w:pStyle w:val="Normal"/>
         <w:numPr>
           <w:ilvl w:val="0"/>
-          <w:numId w:val="5"/>
+          <w:numId w:val="4"/>
         </w:numPr>
         <w:bidi w:val="0"/>
         <w:jc w:val="left"/>
@@ -837,7 +1061,7 @@
         <w:pStyle w:val="Normal"/>
         <w:numPr>
           <w:ilvl w:val="0"/>
-          <w:numId w:val="5"/>
+          <w:numId w:val="4"/>
         </w:numPr>
         <w:bidi w:val="0"/>
         <w:jc w:val="left"/>
@@ -873,7 +1097,7 @@
         <w:pStyle w:val="Normal"/>
         <w:numPr>
           <w:ilvl w:val="0"/>
-          <w:numId w:val="5"/>
+          <w:numId w:val="4"/>
         </w:numPr>
         <w:bidi w:val="0"/>
         <w:jc w:val="left"/>
@@ -906,7 +1130,7 @@
         <w:pStyle w:val="Normal"/>
         <w:numPr>
           <w:ilvl w:val="0"/>
-          <w:numId w:val="5"/>
+          <w:numId w:val="4"/>
         </w:numPr>
         <w:bidi w:val="0"/>
         <w:jc w:val="left"/>
@@ -958,7 +1182,7 @@
         <w:pStyle w:val="Normal"/>
         <w:numPr>
           <w:ilvl w:val="1"/>
-          <w:numId w:val="12"/>
+          <w:numId w:val="11"/>
         </w:numPr>
         <w:bidi w:val="0"/>
         <w:jc w:val="left"/>
@@ -994,7 +1218,7 @@
         <w:pStyle w:val="Normal"/>
         <w:numPr>
           <w:ilvl w:val="2"/>
-          <w:numId w:val="12"/>
+          <w:numId w:val="11"/>
         </w:numPr>
         <w:bidi w:val="0"/>
         <w:jc w:val="left"/>
@@ -1026,7 +1250,7 @@
         <w:pStyle w:val="Normal"/>
         <w:numPr>
           <w:ilvl w:val="1"/>
-          <w:numId w:val="6"/>
+          <w:numId w:val="5"/>
         </w:numPr>
         <w:bidi w:val="0"/>
         <w:jc w:val="left"/>
@@ -1042,7 +1266,7 @@
         <w:pStyle w:val="Normal"/>
         <w:numPr>
           <w:ilvl w:val="2"/>
-          <w:numId w:val="6"/>
+          <w:numId w:val="5"/>
         </w:numPr>
         <w:bidi w:val="0"/>
         <w:jc w:val="left"/>
@@ -1114,7 +1338,7 @@
         <w:pStyle w:val="Normal"/>
         <w:numPr>
           <w:ilvl w:val="1"/>
-          <w:numId w:val="6"/>
+          <w:numId w:val="5"/>
         </w:numPr>
         <w:bidi w:val="0"/>
         <w:jc w:val="left"/>
@@ -1159,7 +1383,7 @@
         <w:pStyle w:val="Normal"/>
         <w:numPr>
           <w:ilvl w:val="1"/>
-          <w:numId w:val="6"/>
+          <w:numId w:val="5"/>
         </w:numPr>
         <w:bidi w:val="0"/>
         <w:jc w:val="left"/>
@@ -1203,7 +1427,7 @@
         <w:pStyle w:val="Normal"/>
         <w:numPr>
           <w:ilvl w:val="1"/>
-          <w:numId w:val="6"/>
+          <w:numId w:val="5"/>
         </w:numPr>
         <w:bidi w:val="0"/>
         <w:jc w:val="left"/>
@@ -1279,7 +1503,7 @@
         <w:pStyle w:val="Normal"/>
         <w:numPr>
           <w:ilvl w:val="0"/>
-          <w:numId w:val="5"/>
+          <w:numId w:val="4"/>
         </w:numPr>
         <w:bidi w:val="0"/>
         <w:jc w:val="left"/>
@@ -1339,7 +1563,7 @@
         <w:pStyle w:val="Heading3"/>
         <w:numPr>
           <w:ilvl w:val="2"/>
-          <w:numId w:val="3"/>
+          <w:numId w:val="2"/>
         </w:numPr>
         <w:ind w:hanging="0" w:left="0"/>
         <w:rPr/>
@@ -1425,7 +1649,7 @@
         <w:pStyle w:val="Normal"/>
         <w:numPr>
           <w:ilvl w:val="1"/>
-          <w:numId w:val="7"/>
+          <w:numId w:val="6"/>
         </w:numPr>
         <w:bidi w:val="0"/>
         <w:jc w:val="left"/>
@@ -1470,35 +1694,21 @@
         <w:pStyle w:val="Normal"/>
         <w:numPr>
           <w:ilvl w:val="2"/>
-          <w:numId w:val="7"/>
-        </w:numPr>
-        <w:bidi w:val="0"/>
-        <w:jc w:val="left"/>
-        <w:rPr>
-          <w:b w:val="false"/>
-          <w:bCs w:val="false"/>
-        </w:rPr>
-      </w:pPr>
-      <w:r>
-        <w:rPr>
-          <w:b w:val="false"/>
-          <w:bCs w:val="false"/>
-        </w:rPr>
-        <w:t xml:space="preserve">If a shortcut to Update Apps is not located on the Desktop, either run the </w:t>
-      </w:r>
-      <w:r>
-        <w:rPr>
-          <w:b w:val="false"/>
-          <w:bCs w:val="false"/>
-        </w:rPr>
-        <w:t>Bootup Bypass Script.cmd again</w:t>
-      </w:r>
-      <w:r>
-        <w:rPr>
-          <w:b w:val="false"/>
-          <w:bCs w:val="false"/>
-        </w:rPr>
-        <w:t xml:space="preserve">, or go to </w:t>
+          <w:numId w:val="6"/>
+        </w:numPr>
+        <w:bidi w:val="0"/>
+        <w:jc w:val="left"/>
+        <w:rPr>
+          <w:b w:val="false"/>
+          <w:bCs w:val="false"/>
+        </w:rPr>
+      </w:pPr>
+      <w:r>
+        <w:rPr>
+          <w:b w:val="false"/>
+          <w:bCs w:val="false"/>
+        </w:rPr>
+        <w:t xml:space="preserve">If a shortcut to Update Apps is not located on the Desktop, either run the Bootup Bypass Script.cmd again, or go to </w:t>
       </w:r>
       <w:hyperlink r:id="rId5">
         <w:r>
@@ -1545,7 +1755,7 @@
         <w:pStyle w:val="Normal"/>
         <w:numPr>
           <w:ilvl w:val="0"/>
-          <w:numId w:val="5"/>
+          <w:numId w:val="4"/>
         </w:numPr>
         <w:bidi w:val="0"/>
         <w:jc w:val="left"/>
@@ -1589,7 +1799,7 @@
         <w:pStyle w:val="Normal"/>
         <w:numPr>
           <w:ilvl w:val="1"/>
-          <w:numId w:val="8"/>
+          <w:numId w:val="7"/>
         </w:numPr>
         <w:bidi w:val="0"/>
         <w:jc w:val="left"/>
@@ -1647,7 +1857,7 @@
         <w:pStyle w:val="Normal"/>
         <w:numPr>
           <w:ilvl w:val="0"/>
-          <w:numId w:val="5"/>
+          <w:numId w:val="4"/>
         </w:numPr>
         <w:bidi w:val="0"/>
         <w:jc w:val="left"/>
@@ -1707,7 +1917,7 @@
         <w:pStyle w:val="Normal"/>
         <w:numPr>
           <w:ilvl w:val="1"/>
-          <w:numId w:val="9"/>
+          <w:numId w:val="8"/>
         </w:numPr>
         <w:bidi w:val="0"/>
         <w:jc w:val="left"/>
@@ -1748,7 +1958,7 @@
         <w:pStyle w:val="Normal"/>
         <w:numPr>
           <w:ilvl w:val="0"/>
-          <w:numId w:val="5"/>
+          <w:numId w:val="4"/>
         </w:numPr>
         <w:bidi w:val="0"/>
         <w:jc w:val="left"/>
@@ -1792,7 +2002,7 @@
         <w:pStyle w:val="Normal"/>
         <w:numPr>
           <w:ilvl w:val="0"/>
-          <w:numId w:val="5"/>
+          <w:numId w:val="4"/>
         </w:numPr>
         <w:bidi w:val="0"/>
         <w:jc w:val="left"/>
@@ -1848,7 +2058,7 @@
         <w:pStyle w:val="Heading3"/>
         <w:numPr>
           <w:ilvl w:val="2"/>
-          <w:numId w:val="3"/>
+          <w:numId w:val="2"/>
         </w:numPr>
         <w:ind w:hanging="0" w:left="0"/>
         <w:rPr/>
@@ -1884,7 +2094,7 @@
         <w:pStyle w:val="Heading"/>
         <w:numPr>
           <w:ilvl w:val="2"/>
-          <w:numId w:val="3"/>
+          <w:numId w:val="2"/>
         </w:numPr>
         <w:rPr/>
       </w:pPr>
@@ -1898,7 +2108,7 @@
         <w:pStyle w:val="BodyText"/>
         <w:numPr>
           <w:ilvl w:val="2"/>
-          <w:numId w:val="3"/>
+          <w:numId w:val="2"/>
         </w:numPr>
         <w:rPr/>
       </w:pPr>
@@ -1911,7 +2121,7 @@
         <w:pStyle w:val="BodyText"/>
         <w:numPr>
           <w:ilvl w:val="0"/>
-          <w:numId w:val="10"/>
+          <w:numId w:val="9"/>
         </w:numPr>
         <w:rPr/>
       </w:pPr>
@@ -1936,7 +2146,7 @@
         <w:pStyle w:val="BodyText"/>
         <w:numPr>
           <w:ilvl w:val="0"/>
-          <w:numId w:val="10"/>
+          <w:numId w:val="9"/>
         </w:numPr>
         <w:rPr/>
       </w:pPr>
@@ -1961,7 +2171,7 @@
         <w:pStyle w:val="BodyText"/>
         <w:numPr>
           <w:ilvl w:val="0"/>
-          <w:numId w:val="10"/>
+          <w:numId w:val="9"/>
         </w:numPr>
         <w:rPr/>
       </w:pPr>
@@ -1986,21 +2196,13 @@
         <w:pStyle w:val="BodyText"/>
         <w:numPr>
           <w:ilvl w:val="0"/>
-          <w:numId w:val="10"/>
-        </w:numPr>
-        <w:rPr/>
-      </w:pPr>
-      <w:r>
-        <w:rPr/>
-        <w:t>In the Power Options screen, under “</w:t>
-      </w:r>
-      <w:r>
-        <w:rPr/>
-        <w:t>Choose or customize a power plan</w:t>
-      </w:r>
-      <w:r>
-        <w:rPr/>
-        <w:t>” you should see one plan option selected, and that plan should be named “KindWorks”</w:t>
+          <w:numId w:val="9"/>
+        </w:numPr>
+        <w:rPr/>
+      </w:pPr>
+      <w:r>
+        <w:rPr/>
+        <w:t>In the Power Options screen, under “Choose or customize a power plan” you should see one plan option selected, and that plan should be named “KindWorks”</w:t>
       </w:r>
     </w:p>
     <w:p>
@@ -2008,7 +2210,7 @@
         <w:pStyle w:val="BodyText"/>
         <w:numPr>
           <w:ilvl w:val="1"/>
-          <w:numId w:val="14"/>
+          <w:numId w:val="12"/>
         </w:numPr>
         <w:rPr/>
       </w:pPr>
@@ -2022,17 +2224,13 @@
         <w:pStyle w:val="BodyText"/>
         <w:numPr>
           <w:ilvl w:val="0"/>
-          <w:numId w:val="10"/>
-        </w:numPr>
-        <w:rPr/>
-      </w:pPr>
-      <w:r>
-        <w:rPr/>
-        <w:t xml:space="preserve">If you see a section called “Plans shown on the battery meter”, and </w:t>
-      </w:r>
-      <w:r>
-        <w:rPr/>
-        <w:t>you do not see the KindWorks plan, follow the next few steps</w:t>
+          <w:numId w:val="9"/>
+        </w:numPr>
+        <w:rPr/>
+      </w:pPr>
+      <w:r>
+        <w:rPr/>
+        <w:t>If you see a section called “Plans shown on the battery meter”, and you do not see the KindWorks plan, follow the next few steps</w:t>
       </w:r>
     </w:p>
     <w:p>
@@ -2040,7 +2238,7 @@
         <w:pStyle w:val="BodyText"/>
         <w:numPr>
           <w:ilvl w:val="1"/>
-          <w:numId w:val="10"/>
+          <w:numId w:val="9"/>
         </w:numPr>
         <w:rPr/>
       </w:pPr>
@@ -2054,7 +2252,7 @@
         <w:pStyle w:val="BodyText"/>
         <w:numPr>
           <w:ilvl w:val="1"/>
-          <w:numId w:val="10"/>
+          <w:numId w:val="9"/>
         </w:numPr>
         <w:rPr/>
       </w:pPr>
@@ -2075,7 +2273,7 @@
         <w:pStyle w:val="BodyText"/>
         <w:numPr>
           <w:ilvl w:val="1"/>
-          <w:numId w:val="10"/>
+          <w:numId w:val="9"/>
         </w:numPr>
         <w:rPr/>
       </w:pPr>
@@ -2107,7 +2305,7 @@
             <wp:extent cx="5875020" cy="2542540"/>
             <wp:effectExtent l="0" t="0" r="0" b="0"/>
             <wp:wrapSquare wrapText="largest"/>
-            <wp:docPr id="1" name="Image1"/>
+            <wp:docPr id="3" name="Image1"/>
             <wp:cNvGraphicFramePr>
               <a:graphicFrameLocks xmlns:a="http://schemas.openxmlformats.org/drawingml/2006/main" noChangeAspect="1"/>
             </wp:cNvGraphicFramePr>
@@ -2115,7 +2313,7 @@
               <a:graphicData uri="http://schemas.openxmlformats.org/drawingml/2006/picture">
                 <pic:pic xmlns:pic="http://schemas.openxmlformats.org/drawingml/2006/picture">
                   <pic:nvPicPr>
-                    <pic:cNvPr id="1" name="Image1"/>
+                    <pic:cNvPr id="3" name="Image1"/>
                     <pic:cNvPicPr>
                       <a:picLocks noChangeAspect="1" noChangeArrowheads="1"/>
                     </pic:cNvPicPr>
@@ -2149,7 +2347,7 @@
         <w:pStyle w:val="BodyText"/>
         <w:numPr>
           <w:ilvl w:val="1"/>
-          <w:numId w:val="3"/>
+          <w:numId w:val="2"/>
         </w:numPr>
         <w:rPr/>
       </w:pPr>
@@ -2234,7 +2432,7 @@
         <w:pStyle w:val="Heading"/>
         <w:numPr>
           <w:ilvl w:val="2"/>
-          <w:numId w:val="3"/>
+          <w:numId w:val="2"/>
         </w:numPr>
         <w:rPr/>
       </w:pPr>
@@ -2248,7 +2446,7 @@
         <w:pStyle w:val="BodyText"/>
         <w:numPr>
           <w:ilvl w:val="2"/>
-          <w:numId w:val="3"/>
+          <w:numId w:val="2"/>
         </w:numPr>
         <w:rPr/>
       </w:pPr>
@@ -2262,7 +2460,7 @@
         <w:pStyle w:val="BodyText"/>
         <w:numPr>
           <w:ilvl w:val="0"/>
-          <w:numId w:val="11"/>
+          <w:numId w:val="10"/>
         </w:numPr>
         <w:rPr/>
       </w:pPr>
@@ -2284,7 +2482,7 @@
         <w:pStyle w:val="BodyText"/>
         <w:numPr>
           <w:ilvl w:val="0"/>
-          <w:numId w:val="11"/>
+          <w:numId w:val="10"/>
         </w:numPr>
         <w:rPr/>
       </w:pPr>
@@ -2298,7 +2496,7 @@
         <w:pStyle w:val="BodyText"/>
         <w:numPr>
           <w:ilvl w:val="0"/>
-          <w:numId w:val="11"/>
+          <w:numId w:val="10"/>
         </w:numPr>
         <w:spacing w:before="0" w:after="140"/>
         <w:rPr/>
@@ -2336,6 +2534,7 @@
         </w:tabs>
         <w:ind w:left="0" w:hanging="0"/>
       </w:pPr>
+      <w:rPr/>
     </w:lvl>
     <w:lvl w:ilvl="1">
       <w:start w:val="1"/>
@@ -2349,6 +2548,7 @@
         </w:tabs>
         <w:ind w:left="0" w:hanging="0"/>
       </w:pPr>
+      <w:rPr/>
     </w:lvl>
     <w:lvl w:ilvl="2">
       <w:start w:val="1"/>
@@ -2362,6 +2562,7 @@
         </w:tabs>
         <w:ind w:left="0" w:hanging="0"/>
       </w:pPr>
+      <w:rPr/>
     </w:lvl>
     <w:lvl w:ilvl="3">
       <w:start w:val="1"/>
@@ -2375,6 +2576,7 @@
         </w:tabs>
         <w:ind w:left="0" w:hanging="0"/>
       </w:pPr>
+      <w:rPr/>
     </w:lvl>
     <w:lvl w:ilvl="4">
       <w:start w:val="1"/>
@@ -2388,6 +2590,7 @@
         </w:tabs>
         <w:ind w:left="0" w:hanging="0"/>
       </w:pPr>
+      <w:rPr/>
     </w:lvl>
     <w:lvl w:ilvl="5">
       <w:start w:val="1"/>
@@ -2401,6 +2604,7 @@
         </w:tabs>
         <w:ind w:left="0" w:hanging="0"/>
       </w:pPr>
+      <w:rPr/>
     </w:lvl>
     <w:lvl w:ilvl="6">
       <w:start w:val="1"/>
@@ -2414,6 +2618,7 @@
         </w:tabs>
         <w:ind w:left="0" w:hanging="0"/>
       </w:pPr>
+      <w:rPr/>
     </w:lvl>
     <w:lvl w:ilvl="7">
       <w:start w:val="1"/>
@@ -2427,6 +2632,7 @@
         </w:tabs>
         <w:ind w:left="0" w:hanging="0"/>
       </w:pPr>
+      <w:rPr/>
     </w:lvl>
     <w:lvl w:ilvl="8">
       <w:start w:val="1"/>
@@ -2440,11 +2646,26 @@
         </w:tabs>
         <w:ind w:left="0" w:hanging="0"/>
       </w:pPr>
+      <w:rPr/>
     </w:lvl>
   </w:abstractNum>
   <w:abstractNum w:abstractNumId="2">
     <w:lvl w:ilvl="0">
       <w:start w:val="1"/>
+      <w:numFmt w:val="decimal"/>
+      <w:suff w:val="nothing"/>
+      <w:lvlText w:val="%1)"/>
+      <w:lvlJc w:val="left"/>
+      <w:pPr>
+        <w:tabs>
+          <w:tab w:val="num" w:pos="0"/>
+        </w:tabs>
+        <w:ind w:left="0" w:hanging="0"/>
+      </w:pPr>
+      <w:rPr/>
+    </w:lvl>
+    <w:lvl w:ilvl="1">
+      <w:start w:val="1"/>
       <w:numFmt w:val="none"/>
       <w:suff w:val="nothing"/>
       <w:lvlText w:val=""/>
@@ -2457,7 +2678,7 @@
       </w:pPr>
       <w:rPr/>
     </w:lvl>
-    <w:lvl w:ilvl="1">
+    <w:lvl w:ilvl="2">
       <w:start w:val="1"/>
       <w:numFmt w:val="none"/>
       <w:suff w:val="nothing"/>
@@ -2471,7 +2692,7 @@
       </w:pPr>
       <w:rPr/>
     </w:lvl>
-    <w:lvl w:ilvl="2">
+    <w:lvl w:ilvl="3">
       <w:start w:val="1"/>
       <w:numFmt w:val="none"/>
       <w:suff w:val="nothing"/>
@@ -2485,7 +2706,7 @@
       </w:pPr>
       <w:rPr/>
     </w:lvl>
-    <w:lvl w:ilvl="3">
+    <w:lvl w:ilvl="4">
       <w:start w:val="1"/>
       <w:numFmt w:val="none"/>
       <w:suff w:val="nothing"/>
@@ -2499,7 +2720,7 @@
       </w:pPr>
       <w:rPr/>
     </w:lvl>
-    <w:lvl w:ilvl="4">
+    <w:lvl w:ilvl="5">
       <w:start w:val="1"/>
       <w:numFmt w:val="none"/>
       <w:suff w:val="nothing"/>
@@ -2513,7 +2734,7 @@
       </w:pPr>
       <w:rPr/>
     </w:lvl>
-    <w:lvl w:ilvl="5">
+    <w:lvl w:ilvl="6">
       <w:start w:val="1"/>
       <w:numFmt w:val="none"/>
       <w:suff w:val="nothing"/>
@@ -2527,7 +2748,7 @@
       </w:pPr>
       <w:rPr/>
     </w:lvl>
-    <w:lvl w:ilvl="6">
+    <w:lvl w:ilvl="7">
       <w:start w:val="1"/>
       <w:numFmt w:val="none"/>
       <w:suff w:val="nothing"/>
@@ -2541,7 +2762,7 @@
       </w:pPr>
       <w:rPr/>
     </w:lvl>
-    <w:lvl w:ilvl="7">
+    <w:lvl w:ilvl="8">
       <w:start w:val="1"/>
       <w:numFmt w:val="none"/>
       <w:suff w:val="nothing"/>
@@ -2555,7 +2776,9 @@
       </w:pPr>
       <w:rPr/>
     </w:lvl>
-    <w:lvl w:ilvl="8">
+  </w:abstractNum>
+  <w:abstractNum w:abstractNumId="3">
+    <w:lvl w:ilvl="0">
       <w:start w:val="1"/>
       <w:numFmt w:val="none"/>
       <w:suff w:val="nothing"/>
@@ -2569,22 +2792,6 @@
       </w:pPr>
       <w:rPr/>
     </w:lvl>
-  </w:abstractNum>
-  <w:abstractNum w:abstractNumId="3">
-    <w:lvl w:ilvl="0">
-      <w:start w:val="1"/>
-      <w:numFmt w:val="decimal"/>
-      <w:suff w:val="nothing"/>
-      <w:lvlText w:val="%1)"/>
-      <w:lvlJc w:val="left"/>
-      <w:pPr>
-        <w:tabs>
-          <w:tab w:val="num" w:pos="0"/>
-        </w:tabs>
-        <w:ind w:left="0" w:hanging="0"/>
-      </w:pPr>
-      <w:rPr/>
-    </w:lvl>
     <w:lvl w:ilvl="1">
       <w:start w:val="1"/>
       <w:numFmt w:val="none"/>
@@ -2701,6 +2908,1304 @@
   <w:abstractNum w:abstractNumId="4">
     <w:lvl w:ilvl="0">
       <w:start w:val="1"/>
+      <w:numFmt w:val="decimal"/>
+      <w:lvlText w:val="%1."/>
+      <w:lvlJc w:val="left"/>
+      <w:pPr>
+        <w:tabs>
+          <w:tab w:val="num" w:pos="720"/>
+        </w:tabs>
+        <w:ind w:left="720" w:hanging="360"/>
+      </w:pPr>
+      <w:rPr/>
+    </w:lvl>
+    <w:lvl w:ilvl="1">
+      <w:start w:val="1"/>
+      <w:numFmt w:val="decimal"/>
+      <w:lvlText w:val="%2."/>
+      <w:lvlJc w:val="left"/>
+      <w:pPr>
+        <w:tabs>
+          <w:tab w:val="num" w:pos="1080"/>
+        </w:tabs>
+        <w:ind w:left="1080" w:hanging="360"/>
+      </w:pPr>
+      <w:rPr/>
+    </w:lvl>
+    <w:lvl w:ilvl="2">
+      <w:start w:val="1"/>
+      <w:numFmt w:val="decimal"/>
+      <w:lvlText w:val="%3."/>
+      <w:lvlJc w:val="left"/>
+      <w:pPr>
+        <w:tabs>
+          <w:tab w:val="num" w:pos="1440"/>
+        </w:tabs>
+        <w:ind w:left="1440" w:hanging="360"/>
+      </w:pPr>
+      <w:rPr/>
+    </w:lvl>
+    <w:lvl w:ilvl="3">
+      <w:start w:val="1"/>
+      <w:numFmt w:val="decimal"/>
+      <w:lvlText w:val="%4."/>
+      <w:lvlJc w:val="left"/>
+      <w:pPr>
+        <w:tabs>
+          <w:tab w:val="num" w:pos="1800"/>
+        </w:tabs>
+        <w:ind w:left="1800" w:hanging="360"/>
+      </w:pPr>
+      <w:rPr/>
+    </w:lvl>
+    <w:lvl w:ilvl="4">
+      <w:start w:val="1"/>
+      <w:numFmt w:val="decimal"/>
+      <w:lvlText w:val="%5."/>
+      <w:lvlJc w:val="left"/>
+      <w:pPr>
+        <w:tabs>
+          <w:tab w:val="num" w:pos="2160"/>
+        </w:tabs>
+        <w:ind w:left="2160" w:hanging="360"/>
+      </w:pPr>
+      <w:rPr/>
+    </w:lvl>
+    <w:lvl w:ilvl="5">
+      <w:start w:val="1"/>
+      <w:numFmt w:val="decimal"/>
+      <w:lvlText w:val="%6."/>
+      <w:lvlJc w:val="left"/>
+      <w:pPr>
+        <w:tabs>
+          <w:tab w:val="num" w:pos="2520"/>
+        </w:tabs>
+        <w:ind w:left="2520" w:hanging="360"/>
+      </w:pPr>
+      <w:rPr/>
+    </w:lvl>
+    <w:lvl w:ilvl="6">
+      <w:start w:val="1"/>
+      <w:numFmt w:val="decimal"/>
+      <w:lvlText w:val="%7."/>
+      <w:lvlJc w:val="left"/>
+      <w:pPr>
+        <w:tabs>
+          <w:tab w:val="num" w:pos="2880"/>
+        </w:tabs>
+        <w:ind w:left="2880" w:hanging="360"/>
+      </w:pPr>
+      <w:rPr/>
+    </w:lvl>
+    <w:lvl w:ilvl="7">
+      <w:start w:val="1"/>
+      <w:numFmt w:val="decimal"/>
+      <w:lvlText w:val="%8."/>
+      <w:lvlJc w:val="left"/>
+      <w:pPr>
+        <w:tabs>
+          <w:tab w:val="num" w:pos="3240"/>
+        </w:tabs>
+        <w:ind w:left="3240" w:hanging="360"/>
+      </w:pPr>
+      <w:rPr/>
+    </w:lvl>
+    <w:lvl w:ilvl="8">
+      <w:start w:val="1"/>
+      <w:numFmt w:val="decimal"/>
+      <w:lvlText w:val="%9."/>
+      <w:lvlJc w:val="left"/>
+      <w:pPr>
+        <w:tabs>
+          <w:tab w:val="num" w:pos="3600"/>
+        </w:tabs>
+        <w:ind w:left="3600" w:hanging="360"/>
+      </w:pPr>
+      <w:rPr/>
+    </w:lvl>
+  </w:abstractNum>
+  <w:abstractNum w:abstractNumId="5">
+    <w:lvl w:ilvl="0">
+      <w:start w:val="1"/>
+      <w:numFmt w:val="bullet"/>
+      <w:lvlText w:val=""/>
+      <w:lvlJc w:val="left"/>
+      <w:pPr>
+        <w:tabs>
+          <w:tab w:val="num" w:pos="720"/>
+        </w:tabs>
+        <w:ind w:left="720" w:hanging="360"/>
+      </w:pPr>
+      <w:rPr>
+        <w:rFonts w:ascii="Symbol" w:hAnsi="Symbol" w:cs="Symbol" w:hint="default"/>
+      </w:rPr>
+    </w:lvl>
+    <w:lvl w:ilvl="1">
+      <w:start w:val="1"/>
+      <w:numFmt w:val="bullet"/>
+      <w:lvlText w:val="◦"/>
+      <w:lvlJc w:val="left"/>
+      <w:pPr>
+        <w:tabs>
+          <w:tab w:val="num" w:pos="1080"/>
+        </w:tabs>
+        <w:ind w:left="1080" w:hanging="360"/>
+      </w:pPr>
+      <w:rPr>
+        <w:rFonts w:ascii="OpenSymbol" w:hAnsi="OpenSymbol" w:cs="OpenSymbol" w:hint="default"/>
+      </w:rPr>
+    </w:lvl>
+    <w:lvl w:ilvl="2">
+      <w:start w:val="1"/>
+      <w:numFmt w:val="bullet"/>
+      <w:lvlText w:val="▪"/>
+      <w:lvlJc w:val="left"/>
+      <w:pPr>
+        <w:tabs>
+          <w:tab w:val="num" w:pos="1440"/>
+        </w:tabs>
+        <w:ind w:left="1440" w:hanging="360"/>
+      </w:pPr>
+      <w:rPr>
+        <w:rFonts w:ascii="OpenSymbol" w:hAnsi="OpenSymbol" w:cs="OpenSymbol" w:hint="default"/>
+      </w:rPr>
+    </w:lvl>
+    <w:lvl w:ilvl="3">
+      <w:start w:val="1"/>
+      <w:numFmt w:val="bullet"/>
+      <w:lvlText w:val=""/>
+      <w:lvlJc w:val="left"/>
+      <w:pPr>
+        <w:tabs>
+          <w:tab w:val="num" w:pos="1800"/>
+        </w:tabs>
+        <w:ind w:left="1800" w:hanging="360"/>
+      </w:pPr>
+      <w:rPr>
+        <w:rFonts w:ascii="Symbol" w:hAnsi="Symbol" w:cs="Symbol" w:hint="default"/>
+      </w:rPr>
+    </w:lvl>
+    <w:lvl w:ilvl="4">
+      <w:start w:val="1"/>
+      <w:numFmt w:val="bullet"/>
+      <w:lvlText w:val="◦"/>
+      <w:lvlJc w:val="left"/>
+      <w:pPr>
+        <w:tabs>
+          <w:tab w:val="num" w:pos="2160"/>
+        </w:tabs>
+        <w:ind w:left="2160" w:hanging="360"/>
+      </w:pPr>
+      <w:rPr>
+        <w:rFonts w:ascii="OpenSymbol" w:hAnsi="OpenSymbol" w:cs="OpenSymbol" w:hint="default"/>
+      </w:rPr>
+    </w:lvl>
+    <w:lvl w:ilvl="5">
+      <w:start w:val="1"/>
+      <w:numFmt w:val="bullet"/>
+      <w:lvlText w:val="▪"/>
+      <w:lvlJc w:val="left"/>
+      <w:pPr>
+        <w:tabs>
+          <w:tab w:val="num" w:pos="2520"/>
+        </w:tabs>
+        <w:ind w:left="2520" w:hanging="360"/>
+      </w:pPr>
+      <w:rPr>
+        <w:rFonts w:ascii="OpenSymbol" w:hAnsi="OpenSymbol" w:cs="OpenSymbol" w:hint="default"/>
+      </w:rPr>
+    </w:lvl>
+    <w:lvl w:ilvl="6">
+      <w:start w:val="1"/>
+      <w:numFmt w:val="bullet"/>
+      <w:lvlText w:val=""/>
+      <w:lvlJc w:val="left"/>
+      <w:pPr>
+        <w:tabs>
+          <w:tab w:val="num" w:pos="2880"/>
+        </w:tabs>
+        <w:ind w:left="2880" w:hanging="360"/>
+      </w:pPr>
+      <w:rPr>
+        <w:rFonts w:ascii="Symbol" w:hAnsi="Symbol" w:cs="Symbol" w:hint="default"/>
+      </w:rPr>
+    </w:lvl>
+    <w:lvl w:ilvl="7">
+      <w:start w:val="1"/>
+      <w:numFmt w:val="bullet"/>
+      <w:lvlText w:val="◦"/>
+      <w:lvlJc w:val="left"/>
+      <w:pPr>
+        <w:tabs>
+          <w:tab w:val="num" w:pos="3240"/>
+        </w:tabs>
+        <w:ind w:left="3240" w:hanging="360"/>
+      </w:pPr>
+      <w:rPr>
+        <w:rFonts w:ascii="OpenSymbol" w:hAnsi="OpenSymbol" w:cs="OpenSymbol" w:hint="default"/>
+      </w:rPr>
+    </w:lvl>
+    <w:lvl w:ilvl="8">
+      <w:start w:val="1"/>
+      <w:numFmt w:val="bullet"/>
+      <w:lvlText w:val="▪"/>
+      <w:lvlJc w:val="left"/>
+      <w:pPr>
+        <w:tabs>
+          <w:tab w:val="num" w:pos="3600"/>
+        </w:tabs>
+        <w:ind w:left="3600" w:hanging="360"/>
+      </w:pPr>
+      <w:rPr>
+        <w:rFonts w:ascii="OpenSymbol" w:hAnsi="OpenSymbol" w:cs="OpenSymbol" w:hint="default"/>
+      </w:rPr>
+    </w:lvl>
+  </w:abstractNum>
+  <w:abstractNum w:abstractNumId="6">
+    <w:lvl w:ilvl="0">
+      <w:start w:val="1"/>
+      <w:numFmt w:val="bullet"/>
+      <w:lvlText w:val=""/>
+      <w:lvlJc w:val="left"/>
+      <w:pPr>
+        <w:tabs>
+          <w:tab w:val="num" w:pos="720"/>
+        </w:tabs>
+        <w:ind w:left="720" w:hanging="360"/>
+      </w:pPr>
+      <w:rPr>
+        <w:rFonts w:ascii="Symbol" w:hAnsi="Symbol" w:cs="Symbol" w:hint="default"/>
+      </w:rPr>
+    </w:lvl>
+    <w:lvl w:ilvl="1">
+      <w:start w:val="1"/>
+      <w:numFmt w:val="bullet"/>
+      <w:lvlText w:val="◦"/>
+      <w:lvlJc w:val="left"/>
+      <w:pPr>
+        <w:tabs>
+          <w:tab w:val="num" w:pos="1080"/>
+        </w:tabs>
+        <w:ind w:left="1080" w:hanging="360"/>
+      </w:pPr>
+      <w:rPr>
+        <w:rFonts w:ascii="OpenSymbol" w:hAnsi="OpenSymbol" w:cs="OpenSymbol" w:hint="default"/>
+      </w:rPr>
+    </w:lvl>
+    <w:lvl w:ilvl="2">
+      <w:start w:val="1"/>
+      <w:numFmt w:val="bullet"/>
+      <w:lvlText w:val="▪"/>
+      <w:lvlJc w:val="left"/>
+      <w:pPr>
+        <w:tabs>
+          <w:tab w:val="num" w:pos="1440"/>
+        </w:tabs>
+        <w:ind w:left="1440" w:hanging="360"/>
+      </w:pPr>
+      <w:rPr>
+        <w:rFonts w:ascii="OpenSymbol" w:hAnsi="OpenSymbol" w:cs="OpenSymbol" w:hint="default"/>
+      </w:rPr>
+    </w:lvl>
+    <w:lvl w:ilvl="3">
+      <w:start w:val="1"/>
+      <w:numFmt w:val="bullet"/>
+      <w:lvlText w:val=""/>
+      <w:lvlJc w:val="left"/>
+      <w:pPr>
+        <w:tabs>
+          <w:tab w:val="num" w:pos="1800"/>
+        </w:tabs>
+        <w:ind w:left="1800" w:hanging="360"/>
+      </w:pPr>
+      <w:rPr>
+        <w:rFonts w:ascii="Symbol" w:hAnsi="Symbol" w:cs="Symbol" w:hint="default"/>
+      </w:rPr>
+    </w:lvl>
+    <w:lvl w:ilvl="4">
+      <w:start w:val="1"/>
+      <w:numFmt w:val="bullet"/>
+      <w:lvlText w:val="◦"/>
+      <w:lvlJc w:val="left"/>
+      <w:pPr>
+        <w:tabs>
+          <w:tab w:val="num" w:pos="2160"/>
+        </w:tabs>
+        <w:ind w:left="2160" w:hanging="360"/>
+      </w:pPr>
+      <w:rPr>
+        <w:rFonts w:ascii="OpenSymbol" w:hAnsi="OpenSymbol" w:cs="OpenSymbol" w:hint="default"/>
+      </w:rPr>
+    </w:lvl>
+    <w:lvl w:ilvl="5">
+      <w:start w:val="1"/>
+      <w:numFmt w:val="bullet"/>
+      <w:lvlText w:val="▪"/>
+      <w:lvlJc w:val="left"/>
+      <w:pPr>
+        <w:tabs>
+          <w:tab w:val="num" w:pos="2520"/>
+        </w:tabs>
+        <w:ind w:left="2520" w:hanging="360"/>
+      </w:pPr>
+      <w:rPr>
+        <w:rFonts w:ascii="OpenSymbol" w:hAnsi="OpenSymbol" w:cs="OpenSymbol" w:hint="default"/>
+      </w:rPr>
+    </w:lvl>
+    <w:lvl w:ilvl="6">
+      <w:start w:val="1"/>
+      <w:numFmt w:val="bullet"/>
+      <w:lvlText w:val=""/>
+      <w:lvlJc w:val="left"/>
+      <w:pPr>
+        <w:tabs>
+          <w:tab w:val="num" w:pos="2880"/>
+        </w:tabs>
+        <w:ind w:left="2880" w:hanging="360"/>
+      </w:pPr>
+      <w:rPr>
+        <w:rFonts w:ascii="Symbol" w:hAnsi="Symbol" w:cs="Symbol" w:hint="default"/>
+      </w:rPr>
+    </w:lvl>
+    <w:lvl w:ilvl="7">
+      <w:start w:val="1"/>
+      <w:numFmt w:val="bullet"/>
+      <w:lvlText w:val="◦"/>
+      <w:lvlJc w:val="left"/>
+      <w:pPr>
+        <w:tabs>
+          <w:tab w:val="num" w:pos="3240"/>
+        </w:tabs>
+        <w:ind w:left="3240" w:hanging="360"/>
+      </w:pPr>
+      <w:rPr>
+        <w:rFonts w:ascii="OpenSymbol" w:hAnsi="OpenSymbol" w:cs="OpenSymbol" w:hint="default"/>
+      </w:rPr>
+    </w:lvl>
+    <w:lvl w:ilvl="8">
+      <w:start w:val="1"/>
+      <w:numFmt w:val="bullet"/>
+      <w:lvlText w:val="▪"/>
+      <w:lvlJc w:val="left"/>
+      <w:pPr>
+        <w:tabs>
+          <w:tab w:val="num" w:pos="3600"/>
+        </w:tabs>
+        <w:ind w:left="3600" w:hanging="360"/>
+      </w:pPr>
+      <w:rPr>
+        <w:rFonts w:ascii="OpenSymbol" w:hAnsi="OpenSymbol" w:cs="OpenSymbol" w:hint="default"/>
+      </w:rPr>
+    </w:lvl>
+  </w:abstractNum>
+  <w:abstractNum w:abstractNumId="7">
+    <w:lvl w:ilvl="0">
+      <w:start w:val="1"/>
+      <w:numFmt w:val="bullet"/>
+      <w:lvlText w:val=""/>
+      <w:lvlJc w:val="left"/>
+      <w:pPr>
+        <w:tabs>
+          <w:tab w:val="num" w:pos="720"/>
+        </w:tabs>
+        <w:ind w:left="720" w:hanging="360"/>
+      </w:pPr>
+      <w:rPr>
+        <w:rFonts w:ascii="Symbol" w:hAnsi="Symbol" w:cs="Symbol" w:hint="default"/>
+      </w:rPr>
+    </w:lvl>
+    <w:lvl w:ilvl="1">
+      <w:start w:val="1"/>
+      <w:numFmt w:val="bullet"/>
+      <w:lvlText w:val="◦"/>
+      <w:lvlJc w:val="left"/>
+      <w:pPr>
+        <w:tabs>
+          <w:tab w:val="num" w:pos="1080"/>
+        </w:tabs>
+        <w:ind w:left="1080" w:hanging="360"/>
+      </w:pPr>
+      <w:rPr>
+        <w:rFonts w:ascii="OpenSymbol" w:hAnsi="OpenSymbol" w:cs="OpenSymbol" w:hint="default"/>
+      </w:rPr>
+    </w:lvl>
+    <w:lvl w:ilvl="2">
+      <w:start w:val="1"/>
+      <w:numFmt w:val="bullet"/>
+      <w:lvlText w:val="▪"/>
+      <w:lvlJc w:val="left"/>
+      <w:pPr>
+        <w:tabs>
+          <w:tab w:val="num" w:pos="1440"/>
+        </w:tabs>
+        <w:ind w:left="1440" w:hanging="360"/>
+      </w:pPr>
+      <w:rPr>
+        <w:rFonts w:ascii="OpenSymbol" w:hAnsi="OpenSymbol" w:cs="OpenSymbol" w:hint="default"/>
+      </w:rPr>
+    </w:lvl>
+    <w:lvl w:ilvl="3">
+      <w:start w:val="1"/>
+      <w:numFmt w:val="bullet"/>
+      <w:lvlText w:val=""/>
+      <w:lvlJc w:val="left"/>
+      <w:pPr>
+        <w:tabs>
+          <w:tab w:val="num" w:pos="1800"/>
+        </w:tabs>
+        <w:ind w:left="1800" w:hanging="360"/>
+      </w:pPr>
+      <w:rPr>
+        <w:rFonts w:ascii="Symbol" w:hAnsi="Symbol" w:cs="Symbol" w:hint="default"/>
+      </w:rPr>
+    </w:lvl>
+    <w:lvl w:ilvl="4">
+      <w:start w:val="1"/>
+      <w:numFmt w:val="bullet"/>
+      <w:lvlText w:val="◦"/>
+      <w:lvlJc w:val="left"/>
+      <w:pPr>
+        <w:tabs>
+          <w:tab w:val="num" w:pos="2160"/>
+        </w:tabs>
+        <w:ind w:left="2160" w:hanging="360"/>
+      </w:pPr>
+      <w:rPr>
+        <w:rFonts w:ascii="OpenSymbol" w:hAnsi="OpenSymbol" w:cs="OpenSymbol" w:hint="default"/>
+      </w:rPr>
+    </w:lvl>
+    <w:lvl w:ilvl="5">
+      <w:start w:val="1"/>
+      <w:numFmt w:val="bullet"/>
+      <w:lvlText w:val="▪"/>
+      <w:lvlJc w:val="left"/>
+      <w:pPr>
+        <w:tabs>
+          <w:tab w:val="num" w:pos="2520"/>
+        </w:tabs>
+        <w:ind w:left="2520" w:hanging="360"/>
+      </w:pPr>
+      <w:rPr>
+        <w:rFonts w:ascii="OpenSymbol" w:hAnsi="OpenSymbol" w:cs="OpenSymbol" w:hint="default"/>
+      </w:rPr>
+    </w:lvl>
+    <w:lvl w:ilvl="6">
+      <w:start w:val="1"/>
+      <w:numFmt w:val="bullet"/>
+      <w:lvlText w:val=""/>
+      <w:lvlJc w:val="left"/>
+      <w:pPr>
+        <w:tabs>
+          <w:tab w:val="num" w:pos="2880"/>
+        </w:tabs>
+        <w:ind w:left="2880" w:hanging="360"/>
+      </w:pPr>
+      <w:rPr>
+        <w:rFonts w:ascii="Symbol" w:hAnsi="Symbol" w:cs="Symbol" w:hint="default"/>
+      </w:rPr>
+    </w:lvl>
+    <w:lvl w:ilvl="7">
+      <w:start w:val="1"/>
+      <w:numFmt w:val="bullet"/>
+      <w:lvlText w:val="◦"/>
+      <w:lvlJc w:val="left"/>
+      <w:pPr>
+        <w:tabs>
+          <w:tab w:val="num" w:pos="3240"/>
+        </w:tabs>
+        <w:ind w:left="3240" w:hanging="360"/>
+      </w:pPr>
+      <w:rPr>
+        <w:rFonts w:ascii="OpenSymbol" w:hAnsi="OpenSymbol" w:cs="OpenSymbol" w:hint="default"/>
+      </w:rPr>
+    </w:lvl>
+    <w:lvl w:ilvl="8">
+      <w:start w:val="1"/>
+      <w:numFmt w:val="bullet"/>
+      <w:lvlText w:val="▪"/>
+      <w:lvlJc w:val="left"/>
+      <w:pPr>
+        <w:tabs>
+          <w:tab w:val="num" w:pos="3600"/>
+        </w:tabs>
+        <w:ind w:left="3600" w:hanging="360"/>
+      </w:pPr>
+      <w:rPr>
+        <w:rFonts w:ascii="OpenSymbol" w:hAnsi="OpenSymbol" w:cs="OpenSymbol" w:hint="default"/>
+      </w:rPr>
+    </w:lvl>
+  </w:abstractNum>
+  <w:abstractNum w:abstractNumId="8">
+    <w:lvl w:ilvl="0">
+      <w:start w:val="1"/>
+      <w:numFmt w:val="bullet"/>
+      <w:lvlText w:val=""/>
+      <w:lvlJc w:val="left"/>
+      <w:pPr>
+        <w:tabs>
+          <w:tab w:val="num" w:pos="720"/>
+        </w:tabs>
+        <w:ind w:left="720" w:hanging="360"/>
+      </w:pPr>
+      <w:rPr>
+        <w:rFonts w:ascii="Symbol" w:hAnsi="Symbol" w:cs="Symbol" w:hint="default"/>
+      </w:rPr>
+    </w:lvl>
+    <w:lvl w:ilvl="1">
+      <w:start w:val="1"/>
+      <w:numFmt w:val="bullet"/>
+      <w:lvlText w:val="◦"/>
+      <w:lvlJc w:val="left"/>
+      <w:pPr>
+        <w:tabs>
+          <w:tab w:val="num" w:pos="1080"/>
+        </w:tabs>
+        <w:ind w:left="1080" w:hanging="360"/>
+      </w:pPr>
+      <w:rPr>
+        <w:rFonts w:ascii="OpenSymbol" w:hAnsi="OpenSymbol" w:cs="OpenSymbol" w:hint="default"/>
+      </w:rPr>
+    </w:lvl>
+    <w:lvl w:ilvl="2">
+      <w:start w:val="1"/>
+      <w:numFmt w:val="bullet"/>
+      <w:lvlText w:val="▪"/>
+      <w:lvlJc w:val="left"/>
+      <w:pPr>
+        <w:tabs>
+          <w:tab w:val="num" w:pos="1440"/>
+        </w:tabs>
+        <w:ind w:left="1440" w:hanging="360"/>
+      </w:pPr>
+      <w:rPr>
+        <w:rFonts w:ascii="OpenSymbol" w:hAnsi="OpenSymbol" w:cs="OpenSymbol" w:hint="default"/>
+      </w:rPr>
+    </w:lvl>
+    <w:lvl w:ilvl="3">
+      <w:start w:val="1"/>
+      <w:numFmt w:val="bullet"/>
+      <w:lvlText w:val=""/>
+      <w:lvlJc w:val="left"/>
+      <w:pPr>
+        <w:tabs>
+          <w:tab w:val="num" w:pos="1800"/>
+        </w:tabs>
+        <w:ind w:left="1800" w:hanging="360"/>
+      </w:pPr>
+      <w:rPr>
+        <w:rFonts w:ascii="Symbol" w:hAnsi="Symbol" w:cs="Symbol" w:hint="default"/>
+      </w:rPr>
+    </w:lvl>
+    <w:lvl w:ilvl="4">
+      <w:start w:val="1"/>
+      <w:numFmt w:val="bullet"/>
+      <w:lvlText w:val="◦"/>
+      <w:lvlJc w:val="left"/>
+      <w:pPr>
+        <w:tabs>
+          <w:tab w:val="num" w:pos="2160"/>
+        </w:tabs>
+        <w:ind w:left="2160" w:hanging="360"/>
+      </w:pPr>
+      <w:rPr>
+        <w:rFonts w:ascii="OpenSymbol" w:hAnsi="OpenSymbol" w:cs="OpenSymbol" w:hint="default"/>
+      </w:rPr>
+    </w:lvl>
+    <w:lvl w:ilvl="5">
+      <w:start w:val="1"/>
+      <w:numFmt w:val="bullet"/>
+      <w:lvlText w:val="▪"/>
+      <w:lvlJc w:val="left"/>
+      <w:pPr>
+        <w:tabs>
+          <w:tab w:val="num" w:pos="2520"/>
+        </w:tabs>
+        <w:ind w:left="2520" w:hanging="360"/>
+      </w:pPr>
+      <w:rPr>
+        <w:rFonts w:ascii="OpenSymbol" w:hAnsi="OpenSymbol" w:cs="OpenSymbol" w:hint="default"/>
+      </w:rPr>
+    </w:lvl>
+    <w:lvl w:ilvl="6">
+      <w:start w:val="1"/>
+      <w:numFmt w:val="bullet"/>
+      <w:lvlText w:val=""/>
+      <w:lvlJc w:val="left"/>
+      <w:pPr>
+        <w:tabs>
+          <w:tab w:val="num" w:pos="2880"/>
+        </w:tabs>
+        <w:ind w:left="2880" w:hanging="360"/>
+      </w:pPr>
+      <w:rPr>
+        <w:rFonts w:ascii="Symbol" w:hAnsi="Symbol" w:cs="Symbol" w:hint="default"/>
+      </w:rPr>
+    </w:lvl>
+    <w:lvl w:ilvl="7">
+      <w:start w:val="1"/>
+      <w:numFmt w:val="bullet"/>
+      <w:lvlText w:val="◦"/>
+      <w:lvlJc w:val="left"/>
+      <w:pPr>
+        <w:tabs>
+          <w:tab w:val="num" w:pos="3240"/>
+        </w:tabs>
+        <w:ind w:left="3240" w:hanging="360"/>
+      </w:pPr>
+      <w:rPr>
+        <w:rFonts w:ascii="OpenSymbol" w:hAnsi="OpenSymbol" w:cs="OpenSymbol" w:hint="default"/>
+      </w:rPr>
+    </w:lvl>
+    <w:lvl w:ilvl="8">
+      <w:start w:val="1"/>
+      <w:numFmt w:val="bullet"/>
+      <w:lvlText w:val="▪"/>
+      <w:lvlJc w:val="left"/>
+      <w:pPr>
+        <w:tabs>
+          <w:tab w:val="num" w:pos="3600"/>
+        </w:tabs>
+        <w:ind w:left="3600" w:hanging="360"/>
+      </w:pPr>
+      <w:rPr>
+        <w:rFonts w:ascii="OpenSymbol" w:hAnsi="OpenSymbol" w:cs="OpenSymbol" w:hint="default"/>
+      </w:rPr>
+    </w:lvl>
+  </w:abstractNum>
+  <w:abstractNum w:abstractNumId="9">
+    <w:lvl w:ilvl="0">
+      <w:start w:val="1"/>
+      <w:numFmt w:val="decimal"/>
+      <w:lvlText w:val="%1)"/>
+      <w:lvlJc w:val="left"/>
+      <w:pPr>
+        <w:tabs>
+          <w:tab w:val="num" w:pos="720"/>
+        </w:tabs>
+        <w:ind w:left="720" w:hanging="360"/>
+      </w:pPr>
+      <w:rPr/>
+    </w:lvl>
+    <w:lvl w:ilvl="1">
+      <w:start w:val="1"/>
+      <w:numFmt w:val="decimal"/>
+      <w:lvlText w:val="%2)"/>
+      <w:lvlJc w:val="left"/>
+      <w:pPr>
+        <w:tabs>
+          <w:tab w:val="num" w:pos="1080"/>
+        </w:tabs>
+        <w:ind w:left="1080" w:hanging="360"/>
+      </w:pPr>
+      <w:rPr/>
+    </w:lvl>
+    <w:lvl w:ilvl="2">
+      <w:start w:val="1"/>
+      <w:numFmt w:val="decimal"/>
+      <w:lvlText w:val="%3)"/>
+      <w:lvlJc w:val="left"/>
+      <w:pPr>
+        <w:tabs>
+          <w:tab w:val="num" w:pos="1440"/>
+        </w:tabs>
+        <w:ind w:left="1440" w:hanging="360"/>
+      </w:pPr>
+      <w:rPr/>
+    </w:lvl>
+    <w:lvl w:ilvl="3">
+      <w:start w:val="1"/>
+      <w:numFmt w:val="decimal"/>
+      <w:lvlText w:val="%4)"/>
+      <w:lvlJc w:val="left"/>
+      <w:pPr>
+        <w:tabs>
+          <w:tab w:val="num" w:pos="1800"/>
+        </w:tabs>
+        <w:ind w:left="1800" w:hanging="360"/>
+      </w:pPr>
+      <w:rPr/>
+    </w:lvl>
+    <w:lvl w:ilvl="4">
+      <w:start w:val="1"/>
+      <w:numFmt w:val="decimal"/>
+      <w:lvlText w:val="%5)"/>
+      <w:lvlJc w:val="left"/>
+      <w:pPr>
+        <w:tabs>
+          <w:tab w:val="num" w:pos="2160"/>
+        </w:tabs>
+        <w:ind w:left="2160" w:hanging="360"/>
+      </w:pPr>
+      <w:rPr/>
+    </w:lvl>
+    <w:lvl w:ilvl="5">
+      <w:start w:val="1"/>
+      <w:numFmt w:val="decimal"/>
+      <w:lvlText w:val="%6)"/>
+      <w:lvlJc w:val="left"/>
+      <w:pPr>
+        <w:tabs>
+          <w:tab w:val="num" w:pos="2520"/>
+        </w:tabs>
+        <w:ind w:left="2520" w:hanging="360"/>
+      </w:pPr>
+      <w:rPr/>
+    </w:lvl>
+    <w:lvl w:ilvl="6">
+      <w:start w:val="1"/>
+      <w:numFmt w:val="decimal"/>
+      <w:lvlText w:val="%7)"/>
+      <w:lvlJc w:val="left"/>
+      <w:pPr>
+        <w:tabs>
+          <w:tab w:val="num" w:pos="2880"/>
+        </w:tabs>
+        <w:ind w:left="2880" w:hanging="360"/>
+      </w:pPr>
+      <w:rPr/>
+    </w:lvl>
+    <w:lvl w:ilvl="7">
+      <w:start w:val="1"/>
+      <w:numFmt w:val="decimal"/>
+      <w:lvlText w:val="%8)"/>
+      <w:lvlJc w:val="left"/>
+      <w:pPr>
+        <w:tabs>
+          <w:tab w:val="num" w:pos="3240"/>
+        </w:tabs>
+        <w:ind w:left="3240" w:hanging="360"/>
+      </w:pPr>
+      <w:rPr/>
+    </w:lvl>
+    <w:lvl w:ilvl="8">
+      <w:start w:val="1"/>
+      <w:numFmt w:val="decimal"/>
+      <w:lvlText w:val="%9)"/>
+      <w:lvlJc w:val="left"/>
+      <w:pPr>
+        <w:tabs>
+          <w:tab w:val="num" w:pos="3600"/>
+        </w:tabs>
+        <w:ind w:left="3600" w:hanging="360"/>
+      </w:pPr>
+      <w:rPr/>
+    </w:lvl>
+  </w:abstractNum>
+  <w:abstractNum w:abstractNumId="10">
+    <w:lvl w:ilvl="0">
+      <w:start w:val="1"/>
+      <w:numFmt w:val="decimal"/>
+      <w:lvlText w:val="%1)"/>
+      <w:lvlJc w:val="left"/>
+      <w:pPr>
+        <w:tabs>
+          <w:tab w:val="num" w:pos="720"/>
+        </w:tabs>
+        <w:ind w:left="720" w:hanging="360"/>
+      </w:pPr>
+      <w:rPr/>
+    </w:lvl>
+    <w:lvl w:ilvl="1">
+      <w:start w:val="1"/>
+      <w:numFmt w:val="decimal"/>
+      <w:lvlText w:val="%2)"/>
+      <w:lvlJc w:val="left"/>
+      <w:pPr>
+        <w:tabs>
+          <w:tab w:val="num" w:pos="1080"/>
+        </w:tabs>
+        <w:ind w:left="1080" w:hanging="360"/>
+      </w:pPr>
+      <w:rPr/>
+    </w:lvl>
+    <w:lvl w:ilvl="2">
+      <w:start w:val="1"/>
+      <w:numFmt w:val="decimal"/>
+      <w:lvlText w:val="%3)"/>
+      <w:lvlJc w:val="left"/>
+      <w:pPr>
+        <w:tabs>
+          <w:tab w:val="num" w:pos="1440"/>
+        </w:tabs>
+        <w:ind w:left="1440" w:hanging="360"/>
+      </w:pPr>
+      <w:rPr/>
+    </w:lvl>
+    <w:lvl w:ilvl="3">
+      <w:start w:val="1"/>
+      <w:numFmt w:val="decimal"/>
+      <w:lvlText w:val="%4)"/>
+      <w:lvlJc w:val="left"/>
+      <w:pPr>
+        <w:tabs>
+          <w:tab w:val="num" w:pos="1800"/>
+        </w:tabs>
+        <w:ind w:left="1800" w:hanging="360"/>
+      </w:pPr>
+      <w:rPr/>
+    </w:lvl>
+    <w:lvl w:ilvl="4">
+      <w:start w:val="1"/>
+      <w:numFmt w:val="decimal"/>
+      <w:lvlText w:val="%5)"/>
+      <w:lvlJc w:val="left"/>
+      <w:pPr>
+        <w:tabs>
+          <w:tab w:val="num" w:pos="2160"/>
+        </w:tabs>
+        <w:ind w:left="2160" w:hanging="360"/>
+      </w:pPr>
+      <w:rPr/>
+    </w:lvl>
+    <w:lvl w:ilvl="5">
+      <w:start w:val="1"/>
+      <w:numFmt w:val="decimal"/>
+      <w:lvlText w:val="%6)"/>
+      <w:lvlJc w:val="left"/>
+      <w:pPr>
+        <w:tabs>
+          <w:tab w:val="num" w:pos="2520"/>
+        </w:tabs>
+        <w:ind w:left="2520" w:hanging="360"/>
+      </w:pPr>
+      <w:rPr/>
+    </w:lvl>
+    <w:lvl w:ilvl="6">
+      <w:start w:val="1"/>
+      <w:numFmt w:val="decimal"/>
+      <w:lvlText w:val="%7)"/>
+      <w:lvlJc w:val="left"/>
+      <w:pPr>
+        <w:tabs>
+          <w:tab w:val="num" w:pos="2880"/>
+        </w:tabs>
+        <w:ind w:left="2880" w:hanging="360"/>
+      </w:pPr>
+      <w:rPr/>
+    </w:lvl>
+    <w:lvl w:ilvl="7">
+      <w:start w:val="1"/>
+      <w:numFmt w:val="decimal"/>
+      <w:lvlText w:val="%8)"/>
+      <w:lvlJc w:val="left"/>
+      <w:pPr>
+        <w:tabs>
+          <w:tab w:val="num" w:pos="3240"/>
+        </w:tabs>
+        <w:ind w:left="3240" w:hanging="360"/>
+      </w:pPr>
+      <w:rPr/>
+    </w:lvl>
+    <w:lvl w:ilvl="8">
+      <w:start w:val="1"/>
+      <w:numFmt w:val="decimal"/>
+      <w:lvlText w:val="%9)"/>
+      <w:lvlJc w:val="left"/>
+      <w:pPr>
+        <w:tabs>
+          <w:tab w:val="num" w:pos="3600"/>
+        </w:tabs>
+        <w:ind w:left="3600" w:hanging="360"/>
+      </w:pPr>
+      <w:rPr/>
+    </w:lvl>
+  </w:abstractNum>
+  <w:abstractNum w:abstractNumId="11">
+    <w:lvl w:ilvl="0">
+      <w:start w:val="1"/>
+      <w:numFmt w:val="bullet"/>
+      <w:lvlText w:val=""/>
+      <w:lvlJc w:val="left"/>
+      <w:pPr>
+        <w:tabs>
+          <w:tab w:val="num" w:pos="720"/>
+        </w:tabs>
+        <w:ind w:left="720" w:hanging="360"/>
+      </w:pPr>
+      <w:rPr>
+        <w:rFonts w:ascii="Symbol" w:hAnsi="Symbol" w:cs="Symbol" w:hint="default"/>
+      </w:rPr>
+    </w:lvl>
+    <w:lvl w:ilvl="1">
+      <w:start w:val="1"/>
+      <w:numFmt w:val="bullet"/>
+      <w:lvlText w:val="◦"/>
+      <w:lvlJc w:val="left"/>
+      <w:pPr>
+        <w:tabs>
+          <w:tab w:val="num" w:pos="1080"/>
+        </w:tabs>
+        <w:ind w:left="1080" w:hanging="360"/>
+      </w:pPr>
+      <w:rPr>
+        <w:rFonts w:ascii="OpenSymbol" w:hAnsi="OpenSymbol" w:cs="OpenSymbol" w:hint="default"/>
+      </w:rPr>
+    </w:lvl>
+    <w:lvl w:ilvl="2">
+      <w:start w:val="1"/>
+      <w:numFmt w:val="bullet"/>
+      <w:lvlText w:val="▪"/>
+      <w:lvlJc w:val="left"/>
+      <w:pPr>
+        <w:tabs>
+          <w:tab w:val="num" w:pos="1440"/>
+        </w:tabs>
+        <w:ind w:left="1440" w:hanging="360"/>
+      </w:pPr>
+      <w:rPr>
+        <w:rFonts w:ascii="OpenSymbol" w:hAnsi="OpenSymbol" w:cs="OpenSymbol" w:hint="default"/>
+      </w:rPr>
+    </w:lvl>
+    <w:lvl w:ilvl="3">
+      <w:start w:val="1"/>
+      <w:numFmt w:val="bullet"/>
+      <w:lvlText w:val=""/>
+      <w:lvlJc w:val="left"/>
+      <w:pPr>
+        <w:tabs>
+          <w:tab w:val="num" w:pos="1800"/>
+        </w:tabs>
+        <w:ind w:left="1800" w:hanging="360"/>
+      </w:pPr>
+      <w:rPr>
+        <w:rFonts w:ascii="Symbol" w:hAnsi="Symbol" w:cs="Symbol" w:hint="default"/>
+      </w:rPr>
+    </w:lvl>
+    <w:lvl w:ilvl="4">
+      <w:start w:val="1"/>
+      <w:numFmt w:val="bullet"/>
+      <w:lvlText w:val="◦"/>
+      <w:lvlJc w:val="left"/>
+      <w:pPr>
+        <w:tabs>
+          <w:tab w:val="num" w:pos="2160"/>
+        </w:tabs>
+        <w:ind w:left="2160" w:hanging="360"/>
+      </w:pPr>
+      <w:rPr>
+        <w:rFonts w:ascii="OpenSymbol" w:hAnsi="OpenSymbol" w:cs="OpenSymbol" w:hint="default"/>
+      </w:rPr>
+    </w:lvl>
+    <w:lvl w:ilvl="5">
+      <w:start w:val="1"/>
+      <w:numFmt w:val="bullet"/>
+      <w:lvlText w:val="▪"/>
+      <w:lvlJc w:val="left"/>
+      <w:pPr>
+        <w:tabs>
+          <w:tab w:val="num" w:pos="2520"/>
+        </w:tabs>
+        <w:ind w:left="2520" w:hanging="360"/>
+      </w:pPr>
+      <w:rPr>
+        <w:rFonts w:ascii="OpenSymbol" w:hAnsi="OpenSymbol" w:cs="OpenSymbol" w:hint="default"/>
+      </w:rPr>
+    </w:lvl>
+    <w:lvl w:ilvl="6">
+      <w:start w:val="1"/>
+      <w:numFmt w:val="bullet"/>
+      <w:lvlText w:val=""/>
+      <w:lvlJc w:val="left"/>
+      <w:pPr>
+        <w:tabs>
+          <w:tab w:val="num" w:pos="2880"/>
+        </w:tabs>
+        <w:ind w:left="2880" w:hanging="360"/>
+      </w:pPr>
+      <w:rPr>
+        <w:rFonts w:ascii="Symbol" w:hAnsi="Symbol" w:cs="Symbol" w:hint="default"/>
+      </w:rPr>
+    </w:lvl>
+    <w:lvl w:ilvl="7">
+      <w:start w:val="1"/>
+      <w:numFmt w:val="bullet"/>
+      <w:lvlText w:val="◦"/>
+      <w:lvlJc w:val="left"/>
+      <w:pPr>
+        <w:tabs>
+          <w:tab w:val="num" w:pos="3240"/>
+        </w:tabs>
+        <w:ind w:left="3240" w:hanging="360"/>
+      </w:pPr>
+      <w:rPr>
+        <w:rFonts w:ascii="OpenSymbol" w:hAnsi="OpenSymbol" w:cs="OpenSymbol" w:hint="default"/>
+      </w:rPr>
+    </w:lvl>
+    <w:lvl w:ilvl="8">
+      <w:start w:val="1"/>
+      <w:numFmt w:val="bullet"/>
+      <w:lvlText w:val="▪"/>
+      <w:lvlJc w:val="left"/>
+      <w:pPr>
+        <w:tabs>
+          <w:tab w:val="num" w:pos="3600"/>
+        </w:tabs>
+        <w:ind w:left="3600" w:hanging="360"/>
+      </w:pPr>
+      <w:rPr>
+        <w:rFonts w:ascii="OpenSymbol" w:hAnsi="OpenSymbol" w:cs="OpenSymbol" w:hint="default"/>
+      </w:rPr>
+    </w:lvl>
+  </w:abstractNum>
+  <w:abstractNum w:abstractNumId="12">
+    <w:lvl w:ilvl="0">
+      <w:start w:val="1"/>
+      <w:numFmt w:val="bullet"/>
+      <w:lvlText w:val=""/>
+      <w:lvlJc w:val="left"/>
+      <w:pPr>
+        <w:tabs>
+          <w:tab w:val="num" w:pos="720"/>
+        </w:tabs>
+        <w:ind w:left="720" w:hanging="360"/>
+      </w:pPr>
+      <w:rPr>
+        <w:rFonts w:ascii="Symbol" w:hAnsi="Symbol" w:cs="Symbol" w:hint="default"/>
+      </w:rPr>
+    </w:lvl>
+    <w:lvl w:ilvl="1">
+      <w:start w:val="1"/>
+      <w:numFmt w:val="bullet"/>
+      <w:lvlText w:val="◦"/>
+      <w:lvlJc w:val="left"/>
+      <w:pPr>
+        <w:tabs>
+          <w:tab w:val="num" w:pos="1080"/>
+        </w:tabs>
+        <w:ind w:left="1080" w:hanging="360"/>
+      </w:pPr>
+      <w:rPr>
+        <w:rFonts w:ascii="OpenSymbol" w:hAnsi="OpenSymbol" w:cs="OpenSymbol" w:hint="default"/>
+      </w:rPr>
+    </w:lvl>
+    <w:lvl w:ilvl="2">
+      <w:start w:val="1"/>
+      <w:numFmt w:val="bullet"/>
+      <w:lvlText w:val="▪"/>
+      <w:lvlJc w:val="left"/>
+      <w:pPr>
+        <w:tabs>
+          <w:tab w:val="num" w:pos="1440"/>
+        </w:tabs>
+        <w:ind w:left="1440" w:hanging="360"/>
+      </w:pPr>
+      <w:rPr>
+        <w:rFonts w:ascii="OpenSymbol" w:hAnsi="OpenSymbol" w:cs="OpenSymbol" w:hint="default"/>
+      </w:rPr>
+    </w:lvl>
+    <w:lvl w:ilvl="3">
+      <w:start w:val="1"/>
+      <w:numFmt w:val="bullet"/>
+      <w:lvlText w:val=""/>
+      <w:lvlJc w:val="left"/>
+      <w:pPr>
+        <w:tabs>
+          <w:tab w:val="num" w:pos="1800"/>
+        </w:tabs>
+        <w:ind w:left="1800" w:hanging="360"/>
+      </w:pPr>
+      <w:rPr>
+        <w:rFonts w:ascii="Symbol" w:hAnsi="Symbol" w:cs="Symbol" w:hint="default"/>
+      </w:rPr>
+    </w:lvl>
+    <w:lvl w:ilvl="4">
+      <w:start w:val="1"/>
+      <w:numFmt w:val="bullet"/>
+      <w:lvlText w:val="◦"/>
+      <w:lvlJc w:val="left"/>
+      <w:pPr>
+        <w:tabs>
+          <w:tab w:val="num" w:pos="2160"/>
+        </w:tabs>
+        <w:ind w:left="2160" w:hanging="360"/>
+      </w:pPr>
+      <w:rPr>
+        <w:rFonts w:ascii="OpenSymbol" w:hAnsi="OpenSymbol" w:cs="OpenSymbol" w:hint="default"/>
+      </w:rPr>
+    </w:lvl>
+    <w:lvl w:ilvl="5">
+      <w:start w:val="1"/>
+      <w:numFmt w:val="bullet"/>
+      <w:lvlText w:val="▪"/>
+      <w:lvlJc w:val="left"/>
+      <w:pPr>
+        <w:tabs>
+          <w:tab w:val="num" w:pos="2520"/>
+        </w:tabs>
+        <w:ind w:left="2520" w:hanging="360"/>
+      </w:pPr>
+      <w:rPr>
+        <w:rFonts w:ascii="OpenSymbol" w:hAnsi="OpenSymbol" w:cs="OpenSymbol" w:hint="default"/>
+      </w:rPr>
+    </w:lvl>
+    <w:lvl w:ilvl="6">
+      <w:start w:val="1"/>
+      <w:numFmt w:val="bullet"/>
+      <w:lvlText w:val=""/>
+      <w:lvlJc w:val="left"/>
+      <w:pPr>
+        <w:tabs>
+          <w:tab w:val="num" w:pos="2880"/>
+        </w:tabs>
+        <w:ind w:left="2880" w:hanging="360"/>
+      </w:pPr>
+      <w:rPr>
+        <w:rFonts w:ascii="Symbol" w:hAnsi="Symbol" w:cs="Symbol" w:hint="default"/>
+      </w:rPr>
+    </w:lvl>
+    <w:lvl w:ilvl="7">
+      <w:start w:val="1"/>
+      <w:numFmt w:val="bullet"/>
+      <w:lvlText w:val="◦"/>
+      <w:lvlJc w:val="left"/>
+      <w:pPr>
+        <w:tabs>
+          <w:tab w:val="num" w:pos="3240"/>
+        </w:tabs>
+        <w:ind w:left="3240" w:hanging="360"/>
+      </w:pPr>
+      <w:rPr>
+        <w:rFonts w:ascii="OpenSymbol" w:hAnsi="OpenSymbol" w:cs="OpenSymbol" w:hint="default"/>
+      </w:rPr>
+    </w:lvl>
+    <w:lvl w:ilvl="8">
+      <w:start w:val="1"/>
+      <w:numFmt w:val="bullet"/>
+      <w:lvlText w:val="▪"/>
+      <w:lvlJc w:val="left"/>
+      <w:pPr>
+        <w:tabs>
+          <w:tab w:val="num" w:pos="3600"/>
+        </w:tabs>
+        <w:ind w:left="3600" w:hanging="360"/>
+      </w:pPr>
+      <w:rPr>
+        <w:rFonts w:ascii="OpenSymbol" w:hAnsi="OpenSymbol" w:cs="OpenSymbol" w:hint="default"/>
+      </w:rPr>
+    </w:lvl>
+  </w:abstractNum>
+  <w:abstractNum w:abstractNumId="13">
+    <w:lvl w:ilvl="0">
+      <w:start w:val="1"/>
+      <w:numFmt w:val="decimal"/>
+      <w:lvlText w:val="%1."/>
+      <w:lvlJc w:val="left"/>
+      <w:pPr>
+        <w:tabs>
+          <w:tab w:val="num" w:pos="720"/>
+        </w:tabs>
+        <w:ind w:left="720" w:hanging="360"/>
+      </w:pPr>
+      <w:rPr/>
+    </w:lvl>
+    <w:lvl w:ilvl="1">
+      <w:start w:val="1"/>
+      <w:numFmt w:val="decimal"/>
+      <w:lvlText w:val="%2."/>
+      <w:lvlJc w:val="left"/>
+      <w:pPr>
+        <w:tabs>
+          <w:tab w:val="num" w:pos="1080"/>
+        </w:tabs>
+        <w:ind w:left="1080" w:hanging="360"/>
+      </w:pPr>
+      <w:rPr/>
+    </w:lvl>
+    <w:lvl w:ilvl="2">
+      <w:start w:val="1"/>
+      <w:numFmt w:val="decimal"/>
+      <w:lvlText w:val="%3."/>
+      <w:lvlJc w:val="left"/>
+      <w:pPr>
+        <w:tabs>
+          <w:tab w:val="num" w:pos="1440"/>
+        </w:tabs>
+        <w:ind w:left="1440" w:hanging="360"/>
+      </w:pPr>
+      <w:rPr/>
+    </w:lvl>
+    <w:lvl w:ilvl="3">
+      <w:start w:val="1"/>
+      <w:numFmt w:val="decimal"/>
+      <w:lvlText w:val="%4."/>
+      <w:lvlJc w:val="left"/>
+      <w:pPr>
+        <w:tabs>
+          <w:tab w:val="num" w:pos="1800"/>
+        </w:tabs>
+        <w:ind w:left="1800" w:hanging="360"/>
+      </w:pPr>
+      <w:rPr/>
+    </w:lvl>
+    <w:lvl w:ilvl="4">
+      <w:start w:val="1"/>
+      <w:numFmt w:val="decimal"/>
+      <w:lvlText w:val="%5."/>
+      <w:lvlJc w:val="left"/>
+      <w:pPr>
+        <w:tabs>
+          <w:tab w:val="num" w:pos="2160"/>
+        </w:tabs>
+        <w:ind w:left="2160" w:hanging="360"/>
+      </w:pPr>
+      <w:rPr/>
+    </w:lvl>
+    <w:lvl w:ilvl="5">
+      <w:start w:val="1"/>
+      <w:numFmt w:val="decimal"/>
+      <w:lvlText w:val="%6."/>
+      <w:lvlJc w:val="left"/>
+      <w:pPr>
+        <w:tabs>
+          <w:tab w:val="num" w:pos="2520"/>
+        </w:tabs>
+        <w:ind w:left="2520" w:hanging="360"/>
+      </w:pPr>
+      <w:rPr/>
+    </w:lvl>
+    <w:lvl w:ilvl="6">
+      <w:start w:val="1"/>
+      <w:numFmt w:val="decimal"/>
+      <w:lvlText w:val="%7."/>
+      <w:lvlJc w:val="left"/>
+      <w:pPr>
+        <w:tabs>
+          <w:tab w:val="num" w:pos="2880"/>
+        </w:tabs>
+        <w:ind w:left="2880" w:hanging="360"/>
+      </w:pPr>
+      <w:rPr/>
+    </w:lvl>
+    <w:lvl w:ilvl="7">
+      <w:start w:val="1"/>
+      <w:numFmt w:val="decimal"/>
+      <w:lvlText w:val="%8."/>
+      <w:lvlJc w:val="left"/>
+      <w:pPr>
+        <w:tabs>
+          <w:tab w:val="num" w:pos="3240"/>
+        </w:tabs>
+        <w:ind w:left="3240" w:hanging="360"/>
+      </w:pPr>
+      <w:rPr/>
+    </w:lvl>
+    <w:lvl w:ilvl="8">
+      <w:start w:val="1"/>
+      <w:numFmt w:val="decimal"/>
+      <w:lvlText w:val="%9."/>
+      <w:lvlJc w:val="left"/>
+      <w:pPr>
+        <w:tabs>
+          <w:tab w:val="num" w:pos="3600"/>
+        </w:tabs>
+        <w:ind w:left="3600" w:hanging="360"/>
+      </w:pPr>
+      <w:rPr/>
+    </w:lvl>
+  </w:abstractNum>
+  <w:abstractNum w:abstractNumId="14">
+    <w:lvl w:ilvl="0">
+      <w:start w:val="1"/>
       <w:numFmt w:val="none"/>
       <w:suff w:val="nothing"/>
       <w:lvlText w:val=""/>
@@ -2711,7 +4216,6 @@
         </w:tabs>
         <w:ind w:left="0" w:hanging="0"/>
       </w:pPr>
-      <w:rPr/>
     </w:lvl>
     <w:lvl w:ilvl="1">
       <w:start w:val="1"/>
@@ -2725,7 +4229,6 @@
         </w:tabs>
         <w:ind w:left="0" w:hanging="0"/>
       </w:pPr>
-      <w:rPr/>
     </w:lvl>
     <w:lvl w:ilvl="2">
       <w:start w:val="1"/>
@@ -2739,7 +4242,6 @@
         </w:tabs>
         <w:ind w:left="0" w:hanging="0"/>
       </w:pPr>
-      <w:rPr/>
     </w:lvl>
     <w:lvl w:ilvl="3">
       <w:start w:val="1"/>
@@ -2753,7 +4255,6 @@
         </w:tabs>
         <w:ind w:left="0" w:hanging="0"/>
       </w:pPr>
-      <w:rPr/>
     </w:lvl>
     <w:lvl w:ilvl="4">
       <w:start w:val="1"/>
@@ -2767,7 +4268,6 @@
         </w:tabs>
         <w:ind w:left="0" w:hanging="0"/>
       </w:pPr>
-      <w:rPr/>
     </w:lvl>
     <w:lvl w:ilvl="5">
       <w:start w:val="1"/>
@@ -2781,7 +4281,6 @@
         </w:tabs>
         <w:ind w:left="0" w:hanging="0"/>
       </w:pPr>
-      <w:rPr/>
     </w:lvl>
     <w:lvl w:ilvl="6">
       <w:start w:val="1"/>
@@ -2795,7 +4294,6 @@
         </w:tabs>
         <w:ind w:left="0" w:hanging="0"/>
       </w:pPr>
-      <w:rPr/>
     </w:lvl>
     <w:lvl w:ilvl="7">
       <w:start w:val="1"/>
@@ -2809,7 +4307,6 @@
         </w:tabs>
         <w:ind w:left="0" w:hanging="0"/>
       </w:pPr>
-      <w:rPr/>
     </w:lvl>
     <w:lvl w:ilvl="8">
       <w:start w:val="1"/>
@@ -2823,1305 +4320,6 @@
         </w:tabs>
         <w:ind w:left="0" w:hanging="0"/>
       </w:pPr>
-      <w:rPr/>
-    </w:lvl>
-  </w:abstractNum>
-  <w:abstractNum w:abstractNumId="5">
-    <w:lvl w:ilvl="0">
-      <w:start w:val="1"/>
-      <w:numFmt w:val="decimal"/>
-      <w:lvlText w:val="%1."/>
-      <w:lvlJc w:val="left"/>
-      <w:pPr>
-        <w:tabs>
-          <w:tab w:val="num" w:pos="720"/>
-        </w:tabs>
-        <w:ind w:left="720" w:hanging="360"/>
-      </w:pPr>
-      <w:rPr/>
-    </w:lvl>
-    <w:lvl w:ilvl="1">
-      <w:start w:val="1"/>
-      <w:numFmt w:val="decimal"/>
-      <w:lvlText w:val="%2."/>
-      <w:lvlJc w:val="left"/>
-      <w:pPr>
-        <w:tabs>
-          <w:tab w:val="num" w:pos="1080"/>
-        </w:tabs>
-        <w:ind w:left="1080" w:hanging="360"/>
-      </w:pPr>
-      <w:rPr/>
-    </w:lvl>
-    <w:lvl w:ilvl="2">
-      <w:start w:val="1"/>
-      <w:numFmt w:val="decimal"/>
-      <w:lvlText w:val="%3."/>
-      <w:lvlJc w:val="left"/>
-      <w:pPr>
-        <w:tabs>
-          <w:tab w:val="num" w:pos="1440"/>
-        </w:tabs>
-        <w:ind w:left="1440" w:hanging="360"/>
-      </w:pPr>
-      <w:rPr/>
-    </w:lvl>
-    <w:lvl w:ilvl="3">
-      <w:start w:val="1"/>
-      <w:numFmt w:val="decimal"/>
-      <w:lvlText w:val="%4."/>
-      <w:lvlJc w:val="left"/>
-      <w:pPr>
-        <w:tabs>
-          <w:tab w:val="num" w:pos="1800"/>
-        </w:tabs>
-        <w:ind w:left="1800" w:hanging="360"/>
-      </w:pPr>
-      <w:rPr/>
-    </w:lvl>
-    <w:lvl w:ilvl="4">
-      <w:start w:val="1"/>
-      <w:numFmt w:val="decimal"/>
-      <w:lvlText w:val="%5."/>
-      <w:lvlJc w:val="left"/>
-      <w:pPr>
-        <w:tabs>
-          <w:tab w:val="num" w:pos="2160"/>
-        </w:tabs>
-        <w:ind w:left="2160" w:hanging="360"/>
-      </w:pPr>
-      <w:rPr/>
-    </w:lvl>
-    <w:lvl w:ilvl="5">
-      <w:start w:val="1"/>
-      <w:numFmt w:val="decimal"/>
-      <w:lvlText w:val="%6."/>
-      <w:lvlJc w:val="left"/>
-      <w:pPr>
-        <w:tabs>
-          <w:tab w:val="num" w:pos="2520"/>
-        </w:tabs>
-        <w:ind w:left="2520" w:hanging="360"/>
-      </w:pPr>
-      <w:rPr/>
-    </w:lvl>
-    <w:lvl w:ilvl="6">
-      <w:start w:val="1"/>
-      <w:numFmt w:val="decimal"/>
-      <w:lvlText w:val="%7."/>
-      <w:lvlJc w:val="left"/>
-      <w:pPr>
-        <w:tabs>
-          <w:tab w:val="num" w:pos="2880"/>
-        </w:tabs>
-        <w:ind w:left="2880" w:hanging="360"/>
-      </w:pPr>
-      <w:rPr/>
-    </w:lvl>
-    <w:lvl w:ilvl="7">
-      <w:start w:val="1"/>
-      <w:numFmt w:val="decimal"/>
-      <w:lvlText w:val="%8."/>
-      <w:lvlJc w:val="left"/>
-      <w:pPr>
-        <w:tabs>
-          <w:tab w:val="num" w:pos="3240"/>
-        </w:tabs>
-        <w:ind w:left="3240" w:hanging="360"/>
-      </w:pPr>
-      <w:rPr/>
-    </w:lvl>
-    <w:lvl w:ilvl="8">
-      <w:start w:val="1"/>
-      <w:numFmt w:val="decimal"/>
-      <w:lvlText w:val="%9."/>
-      <w:lvlJc w:val="left"/>
-      <w:pPr>
-        <w:tabs>
-          <w:tab w:val="num" w:pos="3600"/>
-        </w:tabs>
-        <w:ind w:left="3600" w:hanging="360"/>
-      </w:pPr>
-      <w:rPr/>
-    </w:lvl>
-  </w:abstractNum>
-  <w:abstractNum w:abstractNumId="6">
-    <w:lvl w:ilvl="0">
-      <w:start w:val="1"/>
-      <w:numFmt w:val="bullet"/>
-      <w:lvlText w:val=""/>
-      <w:lvlJc w:val="left"/>
-      <w:pPr>
-        <w:tabs>
-          <w:tab w:val="num" w:pos="720"/>
-        </w:tabs>
-        <w:ind w:left="720" w:hanging="360"/>
-      </w:pPr>
-      <w:rPr>
-        <w:rFonts w:ascii="Symbol" w:hAnsi="Symbol" w:cs="Symbol" w:hint="default"/>
-      </w:rPr>
-    </w:lvl>
-    <w:lvl w:ilvl="1">
-      <w:start w:val="1"/>
-      <w:numFmt w:val="bullet"/>
-      <w:lvlText w:val="◦"/>
-      <w:lvlJc w:val="left"/>
-      <w:pPr>
-        <w:tabs>
-          <w:tab w:val="num" w:pos="1080"/>
-        </w:tabs>
-        <w:ind w:left="1080" w:hanging="360"/>
-      </w:pPr>
-      <w:rPr>
-        <w:rFonts w:ascii="OpenSymbol" w:hAnsi="OpenSymbol" w:cs="OpenSymbol" w:hint="default"/>
-      </w:rPr>
-    </w:lvl>
-    <w:lvl w:ilvl="2">
-      <w:start w:val="1"/>
-      <w:numFmt w:val="bullet"/>
-      <w:lvlText w:val="▪"/>
-      <w:lvlJc w:val="left"/>
-      <w:pPr>
-        <w:tabs>
-          <w:tab w:val="num" w:pos="1440"/>
-        </w:tabs>
-        <w:ind w:left="1440" w:hanging="360"/>
-      </w:pPr>
-      <w:rPr>
-        <w:rFonts w:ascii="OpenSymbol" w:hAnsi="OpenSymbol" w:cs="OpenSymbol" w:hint="default"/>
-      </w:rPr>
-    </w:lvl>
-    <w:lvl w:ilvl="3">
-      <w:start w:val="1"/>
-      <w:numFmt w:val="bullet"/>
-      <w:lvlText w:val=""/>
-      <w:lvlJc w:val="left"/>
-      <w:pPr>
-        <w:tabs>
-          <w:tab w:val="num" w:pos="1800"/>
-        </w:tabs>
-        <w:ind w:left="1800" w:hanging="360"/>
-      </w:pPr>
-      <w:rPr>
-        <w:rFonts w:ascii="Symbol" w:hAnsi="Symbol" w:cs="Symbol" w:hint="default"/>
-      </w:rPr>
-    </w:lvl>
-    <w:lvl w:ilvl="4">
-      <w:start w:val="1"/>
-      <w:numFmt w:val="bullet"/>
-      <w:lvlText w:val="◦"/>
-      <w:lvlJc w:val="left"/>
-      <w:pPr>
-        <w:tabs>
-          <w:tab w:val="num" w:pos="2160"/>
-        </w:tabs>
-        <w:ind w:left="2160" w:hanging="360"/>
-      </w:pPr>
-      <w:rPr>
-        <w:rFonts w:ascii="OpenSymbol" w:hAnsi="OpenSymbol" w:cs="OpenSymbol" w:hint="default"/>
-      </w:rPr>
-    </w:lvl>
-    <w:lvl w:ilvl="5">
-      <w:start w:val="1"/>
-      <w:numFmt w:val="bullet"/>
-      <w:lvlText w:val="▪"/>
-      <w:lvlJc w:val="left"/>
-      <w:pPr>
-        <w:tabs>
-          <w:tab w:val="num" w:pos="2520"/>
-        </w:tabs>
-        <w:ind w:left="2520" w:hanging="360"/>
-      </w:pPr>
-      <w:rPr>
-        <w:rFonts w:ascii="OpenSymbol" w:hAnsi="OpenSymbol" w:cs="OpenSymbol" w:hint="default"/>
-      </w:rPr>
-    </w:lvl>
-    <w:lvl w:ilvl="6">
-      <w:start w:val="1"/>
-      <w:numFmt w:val="bullet"/>
-      <w:lvlText w:val=""/>
-      <w:lvlJc w:val="left"/>
-      <w:pPr>
-        <w:tabs>
-          <w:tab w:val="num" w:pos="2880"/>
-        </w:tabs>
-        <w:ind w:left="2880" w:hanging="360"/>
-      </w:pPr>
-      <w:rPr>
-        <w:rFonts w:ascii="Symbol" w:hAnsi="Symbol" w:cs="Symbol" w:hint="default"/>
-      </w:rPr>
-    </w:lvl>
-    <w:lvl w:ilvl="7">
-      <w:start w:val="1"/>
-      <w:numFmt w:val="bullet"/>
-      <w:lvlText w:val="◦"/>
-      <w:lvlJc w:val="left"/>
-      <w:pPr>
-        <w:tabs>
-          <w:tab w:val="num" w:pos="3240"/>
-        </w:tabs>
-        <w:ind w:left="3240" w:hanging="360"/>
-      </w:pPr>
-      <w:rPr>
-        <w:rFonts w:ascii="OpenSymbol" w:hAnsi="OpenSymbol" w:cs="OpenSymbol" w:hint="default"/>
-      </w:rPr>
-    </w:lvl>
-    <w:lvl w:ilvl="8">
-      <w:start w:val="1"/>
-      <w:numFmt w:val="bullet"/>
-      <w:lvlText w:val="▪"/>
-      <w:lvlJc w:val="left"/>
-      <w:pPr>
-        <w:tabs>
-          <w:tab w:val="num" w:pos="3600"/>
-        </w:tabs>
-        <w:ind w:left="3600" w:hanging="360"/>
-      </w:pPr>
-      <w:rPr>
-        <w:rFonts w:ascii="OpenSymbol" w:hAnsi="OpenSymbol" w:cs="OpenSymbol" w:hint="default"/>
-      </w:rPr>
-    </w:lvl>
-  </w:abstractNum>
-  <w:abstractNum w:abstractNumId="7">
-    <w:lvl w:ilvl="0">
-      <w:start w:val="1"/>
-      <w:numFmt w:val="bullet"/>
-      <w:lvlText w:val=""/>
-      <w:lvlJc w:val="left"/>
-      <w:pPr>
-        <w:tabs>
-          <w:tab w:val="num" w:pos="720"/>
-        </w:tabs>
-        <w:ind w:left="720" w:hanging="360"/>
-      </w:pPr>
-      <w:rPr>
-        <w:rFonts w:ascii="Symbol" w:hAnsi="Symbol" w:cs="Symbol" w:hint="default"/>
-      </w:rPr>
-    </w:lvl>
-    <w:lvl w:ilvl="1">
-      <w:start w:val="1"/>
-      <w:numFmt w:val="bullet"/>
-      <w:lvlText w:val="◦"/>
-      <w:lvlJc w:val="left"/>
-      <w:pPr>
-        <w:tabs>
-          <w:tab w:val="num" w:pos="1080"/>
-        </w:tabs>
-        <w:ind w:left="1080" w:hanging="360"/>
-      </w:pPr>
-      <w:rPr>
-        <w:rFonts w:ascii="OpenSymbol" w:hAnsi="OpenSymbol" w:cs="OpenSymbol" w:hint="default"/>
-      </w:rPr>
-    </w:lvl>
-    <w:lvl w:ilvl="2">
-      <w:start w:val="1"/>
-      <w:numFmt w:val="bullet"/>
-      <w:lvlText w:val="▪"/>
-      <w:lvlJc w:val="left"/>
-      <w:pPr>
-        <w:tabs>
-          <w:tab w:val="num" w:pos="1440"/>
-        </w:tabs>
-        <w:ind w:left="1440" w:hanging="360"/>
-      </w:pPr>
-      <w:rPr>
-        <w:rFonts w:ascii="OpenSymbol" w:hAnsi="OpenSymbol" w:cs="OpenSymbol" w:hint="default"/>
-      </w:rPr>
-    </w:lvl>
-    <w:lvl w:ilvl="3">
-      <w:start w:val="1"/>
-      <w:numFmt w:val="bullet"/>
-      <w:lvlText w:val=""/>
-      <w:lvlJc w:val="left"/>
-      <w:pPr>
-        <w:tabs>
-          <w:tab w:val="num" w:pos="1800"/>
-        </w:tabs>
-        <w:ind w:left="1800" w:hanging="360"/>
-      </w:pPr>
-      <w:rPr>
-        <w:rFonts w:ascii="Symbol" w:hAnsi="Symbol" w:cs="Symbol" w:hint="default"/>
-      </w:rPr>
-    </w:lvl>
-    <w:lvl w:ilvl="4">
-      <w:start w:val="1"/>
-      <w:numFmt w:val="bullet"/>
-      <w:lvlText w:val="◦"/>
-      <w:lvlJc w:val="left"/>
-      <w:pPr>
-        <w:tabs>
-          <w:tab w:val="num" w:pos="2160"/>
-        </w:tabs>
-        <w:ind w:left="2160" w:hanging="360"/>
-      </w:pPr>
-      <w:rPr>
-        <w:rFonts w:ascii="OpenSymbol" w:hAnsi="OpenSymbol" w:cs="OpenSymbol" w:hint="default"/>
-      </w:rPr>
-    </w:lvl>
-    <w:lvl w:ilvl="5">
-      <w:start w:val="1"/>
-      <w:numFmt w:val="bullet"/>
-      <w:lvlText w:val="▪"/>
-      <w:lvlJc w:val="left"/>
-      <w:pPr>
-        <w:tabs>
-          <w:tab w:val="num" w:pos="2520"/>
-        </w:tabs>
-        <w:ind w:left="2520" w:hanging="360"/>
-      </w:pPr>
-      <w:rPr>
-        <w:rFonts w:ascii="OpenSymbol" w:hAnsi="OpenSymbol" w:cs="OpenSymbol" w:hint="default"/>
-      </w:rPr>
-    </w:lvl>
-    <w:lvl w:ilvl="6">
-      <w:start w:val="1"/>
-      <w:numFmt w:val="bullet"/>
-      <w:lvlText w:val=""/>
-      <w:lvlJc w:val="left"/>
-      <w:pPr>
-        <w:tabs>
-          <w:tab w:val="num" w:pos="2880"/>
-        </w:tabs>
-        <w:ind w:left="2880" w:hanging="360"/>
-      </w:pPr>
-      <w:rPr>
-        <w:rFonts w:ascii="Symbol" w:hAnsi="Symbol" w:cs="Symbol" w:hint="default"/>
-      </w:rPr>
-    </w:lvl>
-    <w:lvl w:ilvl="7">
-      <w:start w:val="1"/>
-      <w:numFmt w:val="bullet"/>
-      <w:lvlText w:val="◦"/>
-      <w:lvlJc w:val="left"/>
-      <w:pPr>
-        <w:tabs>
-          <w:tab w:val="num" w:pos="3240"/>
-        </w:tabs>
-        <w:ind w:left="3240" w:hanging="360"/>
-      </w:pPr>
-      <w:rPr>
-        <w:rFonts w:ascii="OpenSymbol" w:hAnsi="OpenSymbol" w:cs="OpenSymbol" w:hint="default"/>
-      </w:rPr>
-    </w:lvl>
-    <w:lvl w:ilvl="8">
-      <w:start w:val="1"/>
-      <w:numFmt w:val="bullet"/>
-      <w:lvlText w:val="▪"/>
-      <w:lvlJc w:val="left"/>
-      <w:pPr>
-        <w:tabs>
-          <w:tab w:val="num" w:pos="3600"/>
-        </w:tabs>
-        <w:ind w:left="3600" w:hanging="360"/>
-      </w:pPr>
-      <w:rPr>
-        <w:rFonts w:ascii="OpenSymbol" w:hAnsi="OpenSymbol" w:cs="OpenSymbol" w:hint="default"/>
-      </w:rPr>
-    </w:lvl>
-  </w:abstractNum>
-  <w:abstractNum w:abstractNumId="8">
-    <w:lvl w:ilvl="0">
-      <w:start w:val="1"/>
-      <w:numFmt w:val="bullet"/>
-      <w:lvlText w:val=""/>
-      <w:lvlJc w:val="left"/>
-      <w:pPr>
-        <w:tabs>
-          <w:tab w:val="num" w:pos="720"/>
-        </w:tabs>
-        <w:ind w:left="720" w:hanging="360"/>
-      </w:pPr>
-      <w:rPr>
-        <w:rFonts w:ascii="Symbol" w:hAnsi="Symbol" w:cs="Symbol" w:hint="default"/>
-      </w:rPr>
-    </w:lvl>
-    <w:lvl w:ilvl="1">
-      <w:start w:val="1"/>
-      <w:numFmt w:val="bullet"/>
-      <w:lvlText w:val="◦"/>
-      <w:lvlJc w:val="left"/>
-      <w:pPr>
-        <w:tabs>
-          <w:tab w:val="num" w:pos="1080"/>
-        </w:tabs>
-        <w:ind w:left="1080" w:hanging="360"/>
-      </w:pPr>
-      <w:rPr>
-        <w:rFonts w:ascii="OpenSymbol" w:hAnsi="OpenSymbol" w:cs="OpenSymbol" w:hint="default"/>
-      </w:rPr>
-    </w:lvl>
-    <w:lvl w:ilvl="2">
-      <w:start w:val="1"/>
-      <w:numFmt w:val="bullet"/>
-      <w:lvlText w:val="▪"/>
-      <w:lvlJc w:val="left"/>
-      <w:pPr>
-        <w:tabs>
-          <w:tab w:val="num" w:pos="1440"/>
-        </w:tabs>
-        <w:ind w:left="1440" w:hanging="360"/>
-      </w:pPr>
-      <w:rPr>
-        <w:rFonts w:ascii="OpenSymbol" w:hAnsi="OpenSymbol" w:cs="OpenSymbol" w:hint="default"/>
-      </w:rPr>
-    </w:lvl>
-    <w:lvl w:ilvl="3">
-      <w:start w:val="1"/>
-      <w:numFmt w:val="bullet"/>
-      <w:lvlText w:val=""/>
-      <w:lvlJc w:val="left"/>
-      <w:pPr>
-        <w:tabs>
-          <w:tab w:val="num" w:pos="1800"/>
-        </w:tabs>
-        <w:ind w:left="1800" w:hanging="360"/>
-      </w:pPr>
-      <w:rPr>
-        <w:rFonts w:ascii="Symbol" w:hAnsi="Symbol" w:cs="Symbol" w:hint="default"/>
-      </w:rPr>
-    </w:lvl>
-    <w:lvl w:ilvl="4">
-      <w:start w:val="1"/>
-      <w:numFmt w:val="bullet"/>
-      <w:lvlText w:val="◦"/>
-      <w:lvlJc w:val="left"/>
-      <w:pPr>
-        <w:tabs>
-          <w:tab w:val="num" w:pos="2160"/>
-        </w:tabs>
-        <w:ind w:left="2160" w:hanging="360"/>
-      </w:pPr>
-      <w:rPr>
-        <w:rFonts w:ascii="OpenSymbol" w:hAnsi="OpenSymbol" w:cs="OpenSymbol" w:hint="default"/>
-      </w:rPr>
-    </w:lvl>
-    <w:lvl w:ilvl="5">
-      <w:start w:val="1"/>
-      <w:numFmt w:val="bullet"/>
-      <w:lvlText w:val="▪"/>
-      <w:lvlJc w:val="left"/>
-      <w:pPr>
-        <w:tabs>
-          <w:tab w:val="num" w:pos="2520"/>
-        </w:tabs>
-        <w:ind w:left="2520" w:hanging="360"/>
-      </w:pPr>
-      <w:rPr>
-        <w:rFonts w:ascii="OpenSymbol" w:hAnsi="OpenSymbol" w:cs="OpenSymbol" w:hint="default"/>
-      </w:rPr>
-    </w:lvl>
-    <w:lvl w:ilvl="6">
-      <w:start w:val="1"/>
-      <w:numFmt w:val="bullet"/>
-      <w:lvlText w:val=""/>
-      <w:lvlJc w:val="left"/>
-      <w:pPr>
-        <w:tabs>
-          <w:tab w:val="num" w:pos="2880"/>
-        </w:tabs>
-        <w:ind w:left="2880" w:hanging="360"/>
-      </w:pPr>
-      <w:rPr>
-        <w:rFonts w:ascii="Symbol" w:hAnsi="Symbol" w:cs="Symbol" w:hint="default"/>
-      </w:rPr>
-    </w:lvl>
-    <w:lvl w:ilvl="7">
-      <w:start w:val="1"/>
-      <w:numFmt w:val="bullet"/>
-      <w:lvlText w:val="◦"/>
-      <w:lvlJc w:val="left"/>
-      <w:pPr>
-        <w:tabs>
-          <w:tab w:val="num" w:pos="3240"/>
-        </w:tabs>
-        <w:ind w:left="3240" w:hanging="360"/>
-      </w:pPr>
-      <w:rPr>
-        <w:rFonts w:ascii="OpenSymbol" w:hAnsi="OpenSymbol" w:cs="OpenSymbol" w:hint="default"/>
-      </w:rPr>
-    </w:lvl>
-    <w:lvl w:ilvl="8">
-      <w:start w:val="1"/>
-      <w:numFmt w:val="bullet"/>
-      <w:lvlText w:val="▪"/>
-      <w:lvlJc w:val="left"/>
-      <w:pPr>
-        <w:tabs>
-          <w:tab w:val="num" w:pos="3600"/>
-        </w:tabs>
-        <w:ind w:left="3600" w:hanging="360"/>
-      </w:pPr>
-      <w:rPr>
-        <w:rFonts w:ascii="OpenSymbol" w:hAnsi="OpenSymbol" w:cs="OpenSymbol" w:hint="default"/>
-      </w:rPr>
-    </w:lvl>
-  </w:abstractNum>
-  <w:abstractNum w:abstractNumId="9">
-    <w:lvl w:ilvl="0">
-      <w:start w:val="1"/>
-      <w:numFmt w:val="bullet"/>
-      <w:lvlText w:val=""/>
-      <w:lvlJc w:val="left"/>
-      <w:pPr>
-        <w:tabs>
-          <w:tab w:val="num" w:pos="720"/>
-        </w:tabs>
-        <w:ind w:left="720" w:hanging="360"/>
-      </w:pPr>
-      <w:rPr>
-        <w:rFonts w:ascii="Symbol" w:hAnsi="Symbol" w:cs="Symbol" w:hint="default"/>
-      </w:rPr>
-    </w:lvl>
-    <w:lvl w:ilvl="1">
-      <w:start w:val="1"/>
-      <w:numFmt w:val="bullet"/>
-      <w:lvlText w:val="◦"/>
-      <w:lvlJc w:val="left"/>
-      <w:pPr>
-        <w:tabs>
-          <w:tab w:val="num" w:pos="1080"/>
-        </w:tabs>
-        <w:ind w:left="1080" w:hanging="360"/>
-      </w:pPr>
-      <w:rPr>
-        <w:rFonts w:ascii="OpenSymbol" w:hAnsi="OpenSymbol" w:cs="OpenSymbol" w:hint="default"/>
-      </w:rPr>
-    </w:lvl>
-    <w:lvl w:ilvl="2">
-      <w:start w:val="1"/>
-      <w:numFmt w:val="bullet"/>
-      <w:lvlText w:val="▪"/>
-      <w:lvlJc w:val="left"/>
-      <w:pPr>
-        <w:tabs>
-          <w:tab w:val="num" w:pos="1440"/>
-        </w:tabs>
-        <w:ind w:left="1440" w:hanging="360"/>
-      </w:pPr>
-      <w:rPr>
-        <w:rFonts w:ascii="OpenSymbol" w:hAnsi="OpenSymbol" w:cs="OpenSymbol" w:hint="default"/>
-      </w:rPr>
-    </w:lvl>
-    <w:lvl w:ilvl="3">
-      <w:start w:val="1"/>
-      <w:numFmt w:val="bullet"/>
-      <w:lvlText w:val=""/>
-      <w:lvlJc w:val="left"/>
-      <w:pPr>
-        <w:tabs>
-          <w:tab w:val="num" w:pos="1800"/>
-        </w:tabs>
-        <w:ind w:left="1800" w:hanging="360"/>
-      </w:pPr>
-      <w:rPr>
-        <w:rFonts w:ascii="Symbol" w:hAnsi="Symbol" w:cs="Symbol" w:hint="default"/>
-      </w:rPr>
-    </w:lvl>
-    <w:lvl w:ilvl="4">
-      <w:start w:val="1"/>
-      <w:numFmt w:val="bullet"/>
-      <w:lvlText w:val="◦"/>
-      <w:lvlJc w:val="left"/>
-      <w:pPr>
-        <w:tabs>
-          <w:tab w:val="num" w:pos="2160"/>
-        </w:tabs>
-        <w:ind w:left="2160" w:hanging="360"/>
-      </w:pPr>
-      <w:rPr>
-        <w:rFonts w:ascii="OpenSymbol" w:hAnsi="OpenSymbol" w:cs="OpenSymbol" w:hint="default"/>
-      </w:rPr>
-    </w:lvl>
-    <w:lvl w:ilvl="5">
-      <w:start w:val="1"/>
-      <w:numFmt w:val="bullet"/>
-      <w:lvlText w:val="▪"/>
-      <w:lvlJc w:val="left"/>
-      <w:pPr>
-        <w:tabs>
-          <w:tab w:val="num" w:pos="2520"/>
-        </w:tabs>
-        <w:ind w:left="2520" w:hanging="360"/>
-      </w:pPr>
-      <w:rPr>
-        <w:rFonts w:ascii="OpenSymbol" w:hAnsi="OpenSymbol" w:cs="OpenSymbol" w:hint="default"/>
-      </w:rPr>
-    </w:lvl>
-    <w:lvl w:ilvl="6">
-      <w:start w:val="1"/>
-      <w:numFmt w:val="bullet"/>
-      <w:lvlText w:val=""/>
-      <w:lvlJc w:val="left"/>
-      <w:pPr>
-        <w:tabs>
-          <w:tab w:val="num" w:pos="2880"/>
-        </w:tabs>
-        <w:ind w:left="2880" w:hanging="360"/>
-      </w:pPr>
-      <w:rPr>
-        <w:rFonts w:ascii="Symbol" w:hAnsi="Symbol" w:cs="Symbol" w:hint="default"/>
-      </w:rPr>
-    </w:lvl>
-    <w:lvl w:ilvl="7">
-      <w:start w:val="1"/>
-      <w:numFmt w:val="bullet"/>
-      <w:lvlText w:val="◦"/>
-      <w:lvlJc w:val="left"/>
-      <w:pPr>
-        <w:tabs>
-          <w:tab w:val="num" w:pos="3240"/>
-        </w:tabs>
-        <w:ind w:left="3240" w:hanging="360"/>
-      </w:pPr>
-      <w:rPr>
-        <w:rFonts w:ascii="OpenSymbol" w:hAnsi="OpenSymbol" w:cs="OpenSymbol" w:hint="default"/>
-      </w:rPr>
-    </w:lvl>
-    <w:lvl w:ilvl="8">
-      <w:start w:val="1"/>
-      <w:numFmt w:val="bullet"/>
-      <w:lvlText w:val="▪"/>
-      <w:lvlJc w:val="left"/>
-      <w:pPr>
-        <w:tabs>
-          <w:tab w:val="num" w:pos="3600"/>
-        </w:tabs>
-        <w:ind w:left="3600" w:hanging="360"/>
-      </w:pPr>
-      <w:rPr>
-        <w:rFonts w:ascii="OpenSymbol" w:hAnsi="OpenSymbol" w:cs="OpenSymbol" w:hint="default"/>
-      </w:rPr>
-    </w:lvl>
-  </w:abstractNum>
-  <w:abstractNum w:abstractNumId="10">
-    <w:lvl w:ilvl="0">
-      <w:start w:val="1"/>
-      <w:numFmt w:val="decimal"/>
-      <w:lvlText w:val="%1)"/>
-      <w:lvlJc w:val="left"/>
-      <w:pPr>
-        <w:tabs>
-          <w:tab w:val="num" w:pos="720"/>
-        </w:tabs>
-        <w:ind w:left="720" w:hanging="360"/>
-      </w:pPr>
-      <w:rPr/>
-    </w:lvl>
-    <w:lvl w:ilvl="1">
-      <w:start w:val="1"/>
-      <w:numFmt w:val="decimal"/>
-      <w:lvlText w:val="%2)"/>
-      <w:lvlJc w:val="left"/>
-      <w:pPr>
-        <w:tabs>
-          <w:tab w:val="num" w:pos="1080"/>
-        </w:tabs>
-        <w:ind w:left="1080" w:hanging="360"/>
-      </w:pPr>
-      <w:rPr/>
-    </w:lvl>
-    <w:lvl w:ilvl="2">
-      <w:start w:val="1"/>
-      <w:numFmt w:val="decimal"/>
-      <w:lvlText w:val="%3)"/>
-      <w:lvlJc w:val="left"/>
-      <w:pPr>
-        <w:tabs>
-          <w:tab w:val="num" w:pos="1440"/>
-        </w:tabs>
-        <w:ind w:left="1440" w:hanging="360"/>
-      </w:pPr>
-      <w:rPr/>
-    </w:lvl>
-    <w:lvl w:ilvl="3">
-      <w:start w:val="1"/>
-      <w:numFmt w:val="decimal"/>
-      <w:lvlText w:val="%4)"/>
-      <w:lvlJc w:val="left"/>
-      <w:pPr>
-        <w:tabs>
-          <w:tab w:val="num" w:pos="1800"/>
-        </w:tabs>
-        <w:ind w:left="1800" w:hanging="360"/>
-      </w:pPr>
-      <w:rPr/>
-    </w:lvl>
-    <w:lvl w:ilvl="4">
-      <w:start w:val="1"/>
-      <w:numFmt w:val="decimal"/>
-      <w:lvlText w:val="%5)"/>
-      <w:lvlJc w:val="left"/>
-      <w:pPr>
-        <w:tabs>
-          <w:tab w:val="num" w:pos="2160"/>
-        </w:tabs>
-        <w:ind w:left="2160" w:hanging="360"/>
-      </w:pPr>
-      <w:rPr/>
-    </w:lvl>
-    <w:lvl w:ilvl="5">
-      <w:start w:val="1"/>
-      <w:numFmt w:val="decimal"/>
-      <w:lvlText w:val="%6)"/>
-      <w:lvlJc w:val="left"/>
-      <w:pPr>
-        <w:tabs>
-          <w:tab w:val="num" w:pos="2520"/>
-        </w:tabs>
-        <w:ind w:left="2520" w:hanging="360"/>
-      </w:pPr>
-      <w:rPr/>
-    </w:lvl>
-    <w:lvl w:ilvl="6">
-      <w:start w:val="1"/>
-      <w:numFmt w:val="decimal"/>
-      <w:lvlText w:val="%7)"/>
-      <w:lvlJc w:val="left"/>
-      <w:pPr>
-        <w:tabs>
-          <w:tab w:val="num" w:pos="2880"/>
-        </w:tabs>
-        <w:ind w:left="2880" w:hanging="360"/>
-      </w:pPr>
-      <w:rPr/>
-    </w:lvl>
-    <w:lvl w:ilvl="7">
-      <w:start w:val="1"/>
-      <w:numFmt w:val="decimal"/>
-      <w:lvlText w:val="%8)"/>
-      <w:lvlJc w:val="left"/>
-      <w:pPr>
-        <w:tabs>
-          <w:tab w:val="num" w:pos="3240"/>
-        </w:tabs>
-        <w:ind w:left="3240" w:hanging="360"/>
-      </w:pPr>
-      <w:rPr/>
-    </w:lvl>
-    <w:lvl w:ilvl="8">
-      <w:start w:val="1"/>
-      <w:numFmt w:val="decimal"/>
-      <w:lvlText w:val="%9)"/>
-      <w:lvlJc w:val="left"/>
-      <w:pPr>
-        <w:tabs>
-          <w:tab w:val="num" w:pos="3600"/>
-        </w:tabs>
-        <w:ind w:left="3600" w:hanging="360"/>
-      </w:pPr>
-      <w:rPr/>
-    </w:lvl>
-  </w:abstractNum>
-  <w:abstractNum w:abstractNumId="11">
-    <w:lvl w:ilvl="0">
-      <w:start w:val="1"/>
-      <w:numFmt w:val="decimal"/>
-      <w:lvlText w:val="%1)"/>
-      <w:lvlJc w:val="left"/>
-      <w:pPr>
-        <w:tabs>
-          <w:tab w:val="num" w:pos="720"/>
-        </w:tabs>
-        <w:ind w:left="720" w:hanging="360"/>
-      </w:pPr>
-      <w:rPr/>
-    </w:lvl>
-    <w:lvl w:ilvl="1">
-      <w:start w:val="1"/>
-      <w:numFmt w:val="decimal"/>
-      <w:lvlText w:val="%2)"/>
-      <w:lvlJc w:val="left"/>
-      <w:pPr>
-        <w:tabs>
-          <w:tab w:val="num" w:pos="1080"/>
-        </w:tabs>
-        <w:ind w:left="1080" w:hanging="360"/>
-      </w:pPr>
-      <w:rPr/>
-    </w:lvl>
-    <w:lvl w:ilvl="2">
-      <w:start w:val="1"/>
-      <w:numFmt w:val="decimal"/>
-      <w:lvlText w:val="%3)"/>
-      <w:lvlJc w:val="left"/>
-      <w:pPr>
-        <w:tabs>
-          <w:tab w:val="num" w:pos="1440"/>
-        </w:tabs>
-        <w:ind w:left="1440" w:hanging="360"/>
-      </w:pPr>
-      <w:rPr/>
-    </w:lvl>
-    <w:lvl w:ilvl="3">
-      <w:start w:val="1"/>
-      <w:numFmt w:val="decimal"/>
-      <w:lvlText w:val="%4)"/>
-      <w:lvlJc w:val="left"/>
-      <w:pPr>
-        <w:tabs>
-          <w:tab w:val="num" w:pos="1800"/>
-        </w:tabs>
-        <w:ind w:left="1800" w:hanging="360"/>
-      </w:pPr>
-      <w:rPr/>
-    </w:lvl>
-    <w:lvl w:ilvl="4">
-      <w:start w:val="1"/>
-      <w:numFmt w:val="decimal"/>
-      <w:lvlText w:val="%5)"/>
-      <w:lvlJc w:val="left"/>
-      <w:pPr>
-        <w:tabs>
-          <w:tab w:val="num" w:pos="2160"/>
-        </w:tabs>
-        <w:ind w:left="2160" w:hanging="360"/>
-      </w:pPr>
-      <w:rPr/>
-    </w:lvl>
-    <w:lvl w:ilvl="5">
-      <w:start w:val="1"/>
-      <w:numFmt w:val="decimal"/>
-      <w:lvlText w:val="%6)"/>
-      <w:lvlJc w:val="left"/>
-      <w:pPr>
-        <w:tabs>
-          <w:tab w:val="num" w:pos="2520"/>
-        </w:tabs>
-        <w:ind w:left="2520" w:hanging="360"/>
-      </w:pPr>
-      <w:rPr/>
-    </w:lvl>
-    <w:lvl w:ilvl="6">
-      <w:start w:val="1"/>
-      <w:numFmt w:val="decimal"/>
-      <w:lvlText w:val="%7)"/>
-      <w:lvlJc w:val="left"/>
-      <w:pPr>
-        <w:tabs>
-          <w:tab w:val="num" w:pos="2880"/>
-        </w:tabs>
-        <w:ind w:left="2880" w:hanging="360"/>
-      </w:pPr>
-      <w:rPr/>
-    </w:lvl>
-    <w:lvl w:ilvl="7">
-      <w:start w:val="1"/>
-      <w:numFmt w:val="decimal"/>
-      <w:lvlText w:val="%8)"/>
-      <w:lvlJc w:val="left"/>
-      <w:pPr>
-        <w:tabs>
-          <w:tab w:val="num" w:pos="3240"/>
-        </w:tabs>
-        <w:ind w:left="3240" w:hanging="360"/>
-      </w:pPr>
-      <w:rPr/>
-    </w:lvl>
-    <w:lvl w:ilvl="8">
-      <w:start w:val="1"/>
-      <w:numFmt w:val="decimal"/>
-      <w:lvlText w:val="%9)"/>
-      <w:lvlJc w:val="left"/>
-      <w:pPr>
-        <w:tabs>
-          <w:tab w:val="num" w:pos="3600"/>
-        </w:tabs>
-        <w:ind w:left="3600" w:hanging="360"/>
-      </w:pPr>
-      <w:rPr/>
-    </w:lvl>
-  </w:abstractNum>
-  <w:abstractNum w:abstractNumId="12">
-    <w:lvl w:ilvl="0">
-      <w:start w:val="1"/>
-      <w:numFmt w:val="bullet"/>
-      <w:lvlText w:val=""/>
-      <w:lvlJc w:val="left"/>
-      <w:pPr>
-        <w:tabs>
-          <w:tab w:val="num" w:pos="720"/>
-        </w:tabs>
-        <w:ind w:left="720" w:hanging="360"/>
-      </w:pPr>
-      <w:rPr>
-        <w:rFonts w:ascii="Symbol" w:hAnsi="Symbol" w:cs="Symbol" w:hint="default"/>
-      </w:rPr>
-    </w:lvl>
-    <w:lvl w:ilvl="1">
-      <w:start w:val="1"/>
-      <w:numFmt w:val="bullet"/>
-      <w:lvlText w:val="◦"/>
-      <w:lvlJc w:val="left"/>
-      <w:pPr>
-        <w:tabs>
-          <w:tab w:val="num" w:pos="1080"/>
-        </w:tabs>
-        <w:ind w:left="1080" w:hanging="360"/>
-      </w:pPr>
-      <w:rPr>
-        <w:rFonts w:ascii="OpenSymbol" w:hAnsi="OpenSymbol" w:cs="OpenSymbol" w:hint="default"/>
-      </w:rPr>
-    </w:lvl>
-    <w:lvl w:ilvl="2">
-      <w:start w:val="1"/>
-      <w:numFmt w:val="bullet"/>
-      <w:lvlText w:val="▪"/>
-      <w:lvlJc w:val="left"/>
-      <w:pPr>
-        <w:tabs>
-          <w:tab w:val="num" w:pos="1440"/>
-        </w:tabs>
-        <w:ind w:left="1440" w:hanging="360"/>
-      </w:pPr>
-      <w:rPr>
-        <w:rFonts w:ascii="OpenSymbol" w:hAnsi="OpenSymbol" w:cs="OpenSymbol" w:hint="default"/>
-      </w:rPr>
-    </w:lvl>
-    <w:lvl w:ilvl="3">
-      <w:start w:val="1"/>
-      <w:numFmt w:val="bullet"/>
-      <w:lvlText w:val=""/>
-      <w:lvlJc w:val="left"/>
-      <w:pPr>
-        <w:tabs>
-          <w:tab w:val="num" w:pos="1800"/>
-        </w:tabs>
-        <w:ind w:left="1800" w:hanging="360"/>
-      </w:pPr>
-      <w:rPr>
-        <w:rFonts w:ascii="Symbol" w:hAnsi="Symbol" w:cs="Symbol" w:hint="default"/>
-      </w:rPr>
-    </w:lvl>
-    <w:lvl w:ilvl="4">
-      <w:start w:val="1"/>
-      <w:numFmt w:val="bullet"/>
-      <w:lvlText w:val="◦"/>
-      <w:lvlJc w:val="left"/>
-      <w:pPr>
-        <w:tabs>
-          <w:tab w:val="num" w:pos="2160"/>
-        </w:tabs>
-        <w:ind w:left="2160" w:hanging="360"/>
-      </w:pPr>
-      <w:rPr>
-        <w:rFonts w:ascii="OpenSymbol" w:hAnsi="OpenSymbol" w:cs="OpenSymbol" w:hint="default"/>
-      </w:rPr>
-    </w:lvl>
-    <w:lvl w:ilvl="5">
-      <w:start w:val="1"/>
-      <w:numFmt w:val="bullet"/>
-      <w:lvlText w:val="▪"/>
-      <w:lvlJc w:val="left"/>
-      <w:pPr>
-        <w:tabs>
-          <w:tab w:val="num" w:pos="2520"/>
-        </w:tabs>
-        <w:ind w:left="2520" w:hanging="360"/>
-      </w:pPr>
-      <w:rPr>
-        <w:rFonts w:ascii="OpenSymbol" w:hAnsi="OpenSymbol" w:cs="OpenSymbol" w:hint="default"/>
-      </w:rPr>
-    </w:lvl>
-    <w:lvl w:ilvl="6">
-      <w:start w:val="1"/>
-      <w:numFmt w:val="bullet"/>
-      <w:lvlText w:val=""/>
-      <w:lvlJc w:val="left"/>
-      <w:pPr>
-        <w:tabs>
-          <w:tab w:val="num" w:pos="2880"/>
-        </w:tabs>
-        <w:ind w:left="2880" w:hanging="360"/>
-      </w:pPr>
-      <w:rPr>
-        <w:rFonts w:ascii="Symbol" w:hAnsi="Symbol" w:cs="Symbol" w:hint="default"/>
-      </w:rPr>
-    </w:lvl>
-    <w:lvl w:ilvl="7">
-      <w:start w:val="1"/>
-      <w:numFmt w:val="bullet"/>
-      <w:lvlText w:val="◦"/>
-      <w:lvlJc w:val="left"/>
-      <w:pPr>
-        <w:tabs>
-          <w:tab w:val="num" w:pos="3240"/>
-        </w:tabs>
-        <w:ind w:left="3240" w:hanging="360"/>
-      </w:pPr>
-      <w:rPr>
-        <w:rFonts w:ascii="OpenSymbol" w:hAnsi="OpenSymbol" w:cs="OpenSymbol" w:hint="default"/>
-      </w:rPr>
-    </w:lvl>
-    <w:lvl w:ilvl="8">
-      <w:start w:val="1"/>
-      <w:numFmt w:val="bullet"/>
-      <w:lvlText w:val="▪"/>
-      <w:lvlJc w:val="left"/>
-      <w:pPr>
-        <w:tabs>
-          <w:tab w:val="num" w:pos="3600"/>
-        </w:tabs>
-        <w:ind w:left="3600" w:hanging="360"/>
-      </w:pPr>
-      <w:rPr>
-        <w:rFonts w:ascii="OpenSymbol" w:hAnsi="OpenSymbol" w:cs="OpenSymbol" w:hint="default"/>
-      </w:rPr>
-    </w:lvl>
-  </w:abstractNum>
-  <w:abstractNum w:abstractNumId="13">
-    <w:lvl w:ilvl="0">
-      <w:start w:val="1"/>
-      <w:numFmt w:val="decimal"/>
-      <w:lvlText w:val="%1."/>
-      <w:lvlJc w:val="left"/>
-      <w:pPr>
-        <w:tabs>
-          <w:tab w:val="num" w:pos="720"/>
-        </w:tabs>
-        <w:ind w:left="720" w:hanging="360"/>
-      </w:pPr>
-      <w:rPr/>
-    </w:lvl>
-    <w:lvl w:ilvl="1">
-      <w:start w:val="1"/>
-      <w:numFmt w:val="decimal"/>
-      <w:lvlText w:val="%2."/>
-      <w:lvlJc w:val="left"/>
-      <w:pPr>
-        <w:tabs>
-          <w:tab w:val="num" w:pos="1080"/>
-        </w:tabs>
-        <w:ind w:left="1080" w:hanging="360"/>
-      </w:pPr>
-      <w:rPr/>
-    </w:lvl>
-    <w:lvl w:ilvl="2">
-      <w:start w:val="1"/>
-      <w:numFmt w:val="decimal"/>
-      <w:lvlText w:val="%3."/>
-      <w:lvlJc w:val="left"/>
-      <w:pPr>
-        <w:tabs>
-          <w:tab w:val="num" w:pos="1440"/>
-        </w:tabs>
-        <w:ind w:left="1440" w:hanging="360"/>
-      </w:pPr>
-      <w:rPr/>
-    </w:lvl>
-    <w:lvl w:ilvl="3">
-      <w:start w:val="1"/>
-      <w:numFmt w:val="decimal"/>
-      <w:lvlText w:val="%4."/>
-      <w:lvlJc w:val="left"/>
-      <w:pPr>
-        <w:tabs>
-          <w:tab w:val="num" w:pos="1800"/>
-        </w:tabs>
-        <w:ind w:left="1800" w:hanging="360"/>
-      </w:pPr>
-      <w:rPr/>
-    </w:lvl>
-    <w:lvl w:ilvl="4">
-      <w:start w:val="1"/>
-      <w:numFmt w:val="decimal"/>
-      <w:lvlText w:val="%5."/>
-      <w:lvlJc w:val="left"/>
-      <w:pPr>
-        <w:tabs>
-          <w:tab w:val="num" w:pos="2160"/>
-        </w:tabs>
-        <w:ind w:left="2160" w:hanging="360"/>
-      </w:pPr>
-      <w:rPr/>
-    </w:lvl>
-    <w:lvl w:ilvl="5">
-      <w:start w:val="1"/>
-      <w:numFmt w:val="decimal"/>
-      <w:lvlText w:val="%6."/>
-      <w:lvlJc w:val="left"/>
-      <w:pPr>
-        <w:tabs>
-          <w:tab w:val="num" w:pos="2520"/>
-        </w:tabs>
-        <w:ind w:left="2520" w:hanging="360"/>
-      </w:pPr>
-      <w:rPr/>
-    </w:lvl>
-    <w:lvl w:ilvl="6">
-      <w:start w:val="1"/>
-      <w:numFmt w:val="decimal"/>
-      <w:lvlText w:val="%7."/>
-      <w:lvlJc w:val="left"/>
-      <w:pPr>
-        <w:tabs>
-          <w:tab w:val="num" w:pos="2880"/>
-        </w:tabs>
-        <w:ind w:left="2880" w:hanging="360"/>
-      </w:pPr>
-      <w:rPr/>
-    </w:lvl>
-    <w:lvl w:ilvl="7">
-      <w:start w:val="1"/>
-      <w:numFmt w:val="decimal"/>
-      <w:lvlText w:val="%8."/>
-      <w:lvlJc w:val="left"/>
-      <w:pPr>
-        <w:tabs>
-          <w:tab w:val="num" w:pos="3240"/>
-        </w:tabs>
-        <w:ind w:left="3240" w:hanging="360"/>
-      </w:pPr>
-      <w:rPr/>
-    </w:lvl>
-    <w:lvl w:ilvl="8">
-      <w:start w:val="1"/>
-      <w:numFmt w:val="decimal"/>
-      <w:lvlText w:val="%9."/>
-      <w:lvlJc w:val="left"/>
-      <w:pPr>
-        <w:tabs>
-          <w:tab w:val="num" w:pos="3600"/>
-        </w:tabs>
-        <w:ind w:left="3600" w:hanging="360"/>
-      </w:pPr>
-      <w:rPr/>
-    </w:lvl>
-  </w:abstractNum>
-  <w:abstractNum w:abstractNumId="14">
-    <w:lvl w:ilvl="0">
-      <w:start w:val="1"/>
-      <w:numFmt w:val="bullet"/>
-      <w:lvlText w:val=""/>
-      <w:lvlJc w:val="left"/>
-      <w:pPr>
-        <w:tabs>
-          <w:tab w:val="num" w:pos="720"/>
-        </w:tabs>
-        <w:ind w:left="720" w:hanging="360"/>
-      </w:pPr>
-      <w:rPr>
-        <w:rFonts w:ascii="Symbol" w:hAnsi="Symbol" w:cs="Symbol" w:hint="default"/>
-      </w:rPr>
-    </w:lvl>
-    <w:lvl w:ilvl="1">
-      <w:start w:val="1"/>
-      <w:numFmt w:val="bullet"/>
-      <w:lvlText w:val="◦"/>
-      <w:lvlJc w:val="left"/>
-      <w:pPr>
-        <w:tabs>
-          <w:tab w:val="num" w:pos="1080"/>
-        </w:tabs>
-        <w:ind w:left="1080" w:hanging="360"/>
-      </w:pPr>
-      <w:rPr>
-        <w:rFonts w:ascii="OpenSymbol" w:hAnsi="OpenSymbol" w:cs="OpenSymbol" w:hint="default"/>
-      </w:rPr>
-    </w:lvl>
-    <w:lvl w:ilvl="2">
-      <w:start w:val="1"/>
-      <w:numFmt w:val="bullet"/>
-      <w:lvlText w:val="▪"/>
-      <w:lvlJc w:val="left"/>
-      <w:pPr>
-        <w:tabs>
-          <w:tab w:val="num" w:pos="1440"/>
-        </w:tabs>
-        <w:ind w:left="1440" w:hanging="360"/>
-      </w:pPr>
-      <w:rPr>
-        <w:rFonts w:ascii="OpenSymbol" w:hAnsi="OpenSymbol" w:cs="OpenSymbol" w:hint="default"/>
-      </w:rPr>
-    </w:lvl>
-    <w:lvl w:ilvl="3">
-      <w:start w:val="1"/>
-      <w:numFmt w:val="bullet"/>
-      <w:lvlText w:val=""/>
-      <w:lvlJc w:val="left"/>
-      <w:pPr>
-        <w:tabs>
-          <w:tab w:val="num" w:pos="1800"/>
-        </w:tabs>
-        <w:ind w:left="1800" w:hanging="360"/>
-      </w:pPr>
-      <w:rPr>
-        <w:rFonts w:ascii="Symbol" w:hAnsi="Symbol" w:cs="Symbol" w:hint="default"/>
-      </w:rPr>
-    </w:lvl>
-    <w:lvl w:ilvl="4">
-      <w:start w:val="1"/>
-      <w:numFmt w:val="bullet"/>
-      <w:lvlText w:val="◦"/>
-      <w:lvlJc w:val="left"/>
-      <w:pPr>
-        <w:tabs>
-          <w:tab w:val="num" w:pos="2160"/>
-        </w:tabs>
-        <w:ind w:left="2160" w:hanging="360"/>
-      </w:pPr>
-      <w:rPr>
-        <w:rFonts w:ascii="OpenSymbol" w:hAnsi="OpenSymbol" w:cs="OpenSymbol" w:hint="default"/>
-      </w:rPr>
-    </w:lvl>
-    <w:lvl w:ilvl="5">
-      <w:start w:val="1"/>
-      <w:numFmt w:val="bullet"/>
-      <w:lvlText w:val="▪"/>
-      <w:lvlJc w:val="left"/>
-      <w:pPr>
-        <w:tabs>
-          <w:tab w:val="num" w:pos="2520"/>
-        </w:tabs>
-        <w:ind w:left="2520" w:hanging="360"/>
-      </w:pPr>
-      <w:rPr>
-        <w:rFonts w:ascii="OpenSymbol" w:hAnsi="OpenSymbol" w:cs="OpenSymbol" w:hint="default"/>
-      </w:rPr>
-    </w:lvl>
-    <w:lvl w:ilvl="6">
-      <w:start w:val="1"/>
-      <w:numFmt w:val="bullet"/>
-      <w:lvlText w:val=""/>
-      <w:lvlJc w:val="left"/>
-      <w:pPr>
-        <w:tabs>
-          <w:tab w:val="num" w:pos="2880"/>
-        </w:tabs>
-        <w:ind w:left="2880" w:hanging="360"/>
-      </w:pPr>
-      <w:rPr>
-        <w:rFonts w:ascii="Symbol" w:hAnsi="Symbol" w:cs="Symbol" w:hint="default"/>
-      </w:rPr>
-    </w:lvl>
-    <w:lvl w:ilvl="7">
-      <w:start w:val="1"/>
-      <w:numFmt w:val="bullet"/>
-      <w:lvlText w:val="◦"/>
-      <w:lvlJc w:val="left"/>
-      <w:pPr>
-        <w:tabs>
-          <w:tab w:val="num" w:pos="3240"/>
-        </w:tabs>
-        <w:ind w:left="3240" w:hanging="360"/>
-      </w:pPr>
-      <w:rPr>
-        <w:rFonts w:ascii="OpenSymbol" w:hAnsi="OpenSymbol" w:cs="OpenSymbol" w:hint="default"/>
-      </w:rPr>
-    </w:lvl>
-    <w:lvl w:ilvl="8">
-      <w:start w:val="1"/>
-      <w:numFmt w:val="bullet"/>
-      <w:lvlText w:val="▪"/>
-      <w:lvlJc w:val="left"/>
-      <w:pPr>
-        <w:tabs>
-          <w:tab w:val="num" w:pos="3600"/>
-        </w:tabs>
-        <w:ind w:left="3600" w:hanging="360"/>
-      </w:pPr>
-      <w:rPr>
-        <w:rFonts w:ascii="OpenSymbol" w:hAnsi="OpenSymbol" w:cs="OpenSymbol" w:hint="default"/>
-      </w:rPr>
     </w:lvl>
   </w:abstractNum>
   <w:num w:numId="1">
@@ -4167,7 +4365,7 @@
     <w:abstractNumId w:val="14"/>
   </w:num>
   <w:num w:numId="15">
-    <w:abstractNumId w:val="5"/>
+    <w:abstractNumId w:val="4"/>
     <w:lvlOverride w:ilvl="0">
       <w:startOverride w:val="1"/>
     </w:lvlOverride>
@@ -4220,7 +4418,7 @@
     <w:pPr>
       <w:numPr>
         <w:ilvl w:val="0"/>
-        <w:numId w:val="2"/>
+        <w:numId w:val="1"/>
       </w:numPr>
       <w:spacing w:before="240" w:after="120"/>
       <w:outlineLvl w:val="0"/>
@@ -4240,7 +4438,7 @@
     <w:pPr>
       <w:numPr>
         <w:ilvl w:val="1"/>
-        <w:numId w:val="4"/>
+        <w:numId w:val="3"/>
       </w:numPr>
       <w:spacing w:before="200" w:after="120"/>
       <w:outlineLvl w:val="1"/>
@@ -4260,7 +4458,7 @@
     <w:pPr>
       <w:numPr>
         <w:ilvl w:val="2"/>
-        <w:numId w:val="3"/>
+        <w:numId w:val="2"/>
       </w:numPr>
       <w:spacing w:before="140" w:after="120"/>
       <w:outlineLvl w:val="2"/>
@@ -4277,8 +4475,8 @@
     <w:qFormat/>
     <w:rPr/>
   </w:style>
-  <w:style w:type="character" w:styleId="Bullets">
-    <w:name w:val="Bullets"/>
+  <w:style w:type="character" w:styleId="Bulletsuser">
+    <w:name w:val="Bullets (user)"/>
     <w:qFormat/>
     <w:rPr>
       <w:rFonts w:ascii="OpenSymbol" w:hAnsi="OpenSymbol" w:eastAsia="OpenSymbol" w:cs="OpenSymbol"/>
@@ -4298,8 +4496,8 @@
       <w:u w:val="single"/>
     </w:rPr>
   </w:style>
-  <w:style w:type="character" w:styleId="Bulletsuser">
-    <w:name w:val="Bullets (user)"/>
+  <w:style w:type="character" w:styleId="Bullets">
+    <w:name w:val="Bullets"/>
     <w:qFormat/>
     <w:rPr>
       <w:rFonts w:ascii="OpenSymbol" w:hAnsi="OpenSymbol" w:eastAsia="OpenSymbol" w:cs="OpenSymbol"/>
@@ -4389,37 +4587,37 @@
         <a:srgbClr val="000000"/>
       </a:dk1>
       <a:lt1>
-        <a:srgbClr val="ffffff"/>
+        <a:srgbClr val="FFFFFF"/>
       </a:lt1>
       <a:dk2>
         <a:srgbClr val="000000"/>
       </a:dk2>
       <a:lt2>
-        <a:srgbClr val="ffffff"/>
+        <a:srgbClr val="FFFFFF"/>
       </a:lt2>
       <a:accent1>
-        <a:srgbClr val="18a303"/>
+        <a:srgbClr val="18A303"/>
       </a:accent1>
       <a:accent2>
-        <a:srgbClr val="0369a3"/>
+        <a:srgbClr val="0369A3"/>
       </a:accent2>
       <a:accent3>
-        <a:srgbClr val="a33e03"/>
+        <a:srgbClr val="A33E03"/>
       </a:accent3>
       <a:accent4>
-        <a:srgbClr val="8e03a3"/>
+        <a:srgbClr val="8E03A3"/>
       </a:accent4>
       <a:accent5>
-        <a:srgbClr val="c99c00"/>
+        <a:srgbClr val="C99C00"/>
       </a:accent5>
       <a:accent6>
-        <a:srgbClr val="c9211e"/>
+        <a:srgbClr val="C9211E"/>
       </a:accent6>
       <a:hlink>
-        <a:srgbClr val="0000ee"/>
+        <a:srgbClr val="0000EE"/>
       </a:hlink>
       <a:folHlink>
-        <a:srgbClr val="551a8b"/>
+        <a:srgbClr val="551A8B"/>
       </a:folHlink>
     </a:clrScheme>
     <a:fontScheme name="Office">

</xml_diff>